<commit_message>
docs: embed high-resolution rendered diagram images and UI screenshots into docx and repo
</commit_message>
<xml_diff>
--- a/ARQUITECTURA_Y_DIAGRAMAS_TIENDA_BOLSILLO_WEB.docx
+++ b/ARQUITECTURA_Y_DIAGRAMAS_TIENDA_BOLSILLO_WEB.docx
@@ -13,7 +13,7 @@
           <w:color w:val="E53935"/>
           <w:sz w:val="22"/>
         </w:rPr>
-        <w:t>INGENIERÍA DE SOFTWARE &amp; ARQUITECTURA DE SISTEMAS</w:t>
+        <w:t>DOSSIER TÉCNICO VISUAL &amp; ARQUITECTURA DE SOFTWARE</w:t>
         <w:br/>
       </w:r>
       <w:r>
@@ -23,24 +23,24 @@
           <w:color w:val="1E293B"/>
           <w:sz w:val="44"/>
         </w:rPr>
-        <w:t>Especificación Técnica y Modelado de Procesos: Registro de Mi Negocio Web</w:t>
+        <w:t>Modelado Visual de Pantallas, Componentes y Flujos de Subproceso</w:t>
       </w:r>
     </w:p>
     <w:p>
       <w:pPr>
-        <w:spacing w:before="80" w:after="240"/>
+        <w:spacing w:before="80" w:after="280"/>
       </w:pPr>
       <w:r>
-        <w:t>Proyecto: Tienda Bolsillo Web (Scrum - 7 Sprints) • Referencia: Plan de Trabajo de Jeanderli Mendoza</w:t>
+        <w:t>Proyecto: Tienda Bolsillo Web • Planificación Funcional y Técnica con Enfoque Scrum (7 Sprints)</w:t>
         <w:br/>
-        <w:t>Modelado de Software: Componentes, Navegación, Arquitectura de Sistema, ER y 6 Flujos de Subproceso</w:t>
+        <w:t>Referencia Oficial: Plan de Trabajo de Jeanderli Mendoza (Historias de Usuario HU-01 a HU-23)</w:t>
         <w:br/>
-        <w:t>Repositorio Git: https://github.com/diegotorres006/Login_Version_Beta_TiendaBolsillo</w:t>
+        <w:t>Autor: Juan Diego Torres Maldonado • Repositorio GitHub: https://github.com/diegotorres006/Login_Version_Beta_TiendaBolsillo</w:t>
       </w:r>
     </w:p>
     <w:p>
       <w:pPr>
-        <w:spacing w:before="280" w:after="120"/>
+        <w:spacing w:before="320" w:after="120"/>
       </w:pPr>
       <w:r>
         <w:rPr>
@@ -49,23 +49,361 @@
           <w:color w:val="1E293B"/>
           <w:sz w:val="30"/>
         </w:rPr>
-        <w:t>1. Introducción y Alineación con el Plan de Trabajo</w:t>
+        <w:t>1. Capturas de la Aplicación Android Beta y Especificación Funcional</w:t>
       </w:r>
     </w:p>
     <w:p>
       <w:pPr>
-        <w:spacing w:before="0" w:after="160" w:line="276" w:lineRule="auto"/>
+        <w:spacing w:before="0" w:after="120" w:line="276" w:lineRule="auto"/>
       </w:pPr>
       <w:r>
-        <w:t>El presente informe da estricto cumplimiento a los requerimientos técnicos y de diseño formulados a partir del documento 'PLAN DE TRABAJO - Registro de Mi Negocio en la Web' (Jeanderli Mendoza). El objetivo es formalizar la arquitectura de software completa para habilitar el onboarding comercial en Tienda Bolsillo, cubriendo desde la captura inicial de datos, la contratación dinámica de suscripciones Premium, la carga probatoria y KYC, hasta los mecanismos de fiscalización administrativa, rechazo fundamentado y alta definitiva en plataforma.</w:t>
-        <w:br/>
-        <w:br/>
-        <w:t>A continuación se detallan los 4 modelos arquitectónicos globales y los 6 flujos de subprocesos específicos requeridos.</w:t>
+        <w:rPr>
+          <w:rFonts w:ascii="Calibri" w:hAnsi="Calibri"/>
+          <w:color w:val="334155"/>
+          <w:sz w:val="20"/>
+        </w:rPr>
+        <w:t>A continuación se presentan las 4 pantallas originales de la aplicación móvil Android Beta que sirven como punto de partida para el rediseño web y el levantamiento de requerimientos (Fases 1 y 2 del Plan de Trabajo):</w:t>
       </w:r>
     </w:p>
     <w:p>
       <w:pPr>
-        <w:spacing w:before="280" w:after="120"/>
+        <w:spacing w:before="240" w:after="80"/>
+      </w:pPr>
+      <w:r>
+        <w:rPr>
+          <w:rFonts w:ascii="Calibri" w:hAnsi="Calibri"/>
+          <w:b/>
+          <w:color w:val="2B6CB0"/>
+          <w:sz w:val="24"/>
+        </w:rPr>
+        <w:t>Pantalla 1: Iniciar Sesión (Android Beta)</w:t>
+      </w:r>
+    </w:p>
+    <w:p>
+      <w:pPr>
+        <w:spacing w:before="0" w:after="120" w:line="276" w:lineRule="auto"/>
+      </w:pPr>
+      <w:r>
+        <w:rPr>
+          <w:rFonts w:ascii="Calibri" w:hAnsi="Calibri"/>
+          <w:color w:val="334155"/>
+          <w:sz w:val="20"/>
+        </w:rPr>
+        <w:t>Vista de acceso con campos de correo electrónico y contraseña (con botón de visibilidad), acceso a recuperación de clave y enlace a registro.</w:t>
+      </w:r>
+    </w:p>
+    <w:p>
+      <w:pPr>
+        <w:spacing w:before="120" w:after="40"/>
+        <w:jc w:val="center"/>
+      </w:pPr>
+    </w:p>
+    <w:p>
+      <w:r>
+        <w:drawing>
+          <wp:inline xmlns:a="http://schemas.openxmlformats.org/drawingml/2006/main" xmlns:pic="http://schemas.openxmlformats.org/drawingml/2006/picture">
+            <wp:extent cx="2926080" cy="1591628"/>
+            <wp:docPr id="1" name="Picture 1"/>
+            <wp:cNvGraphicFramePr>
+              <a:graphicFrameLocks noChangeAspect="1"/>
+            </wp:cNvGraphicFramePr>
+            <a:graphic>
+              <a:graphicData uri="http://schemas.openxmlformats.org/drawingml/2006/picture">
+                <pic:pic>
+                  <pic:nvPicPr>
+                    <pic:cNvPr id="0" name="01_android_login.png"/>
+                    <pic:cNvPicPr/>
+                  </pic:nvPicPr>
+                  <pic:blipFill>
+                    <a:blip r:embed="rId10"/>
+                    <a:stretch>
+                      <a:fillRect/>
+                    </a:stretch>
+                  </pic:blipFill>
+                  <pic:spPr>
+                    <a:xfrm>
+                      <a:off x="0" y="0"/>
+                      <a:ext cx="2926080" cy="1591628"/>
+                    </a:xfrm>
+                    <a:prstGeom prst="rect"/>
+                  </pic:spPr>
+                </pic:pic>
+              </a:graphicData>
+            </a:graphic>
+          </wp:inline>
+        </w:drawing>
+      </w:r>
+    </w:p>
+    <w:p>
+      <w:pPr>
+        <w:spacing w:before="40" w:after="160"/>
+        <w:jc w:val="center"/>
+      </w:pPr>
+      <w:r>
+        <w:rPr>
+          <w:rFonts w:ascii="Calibri" w:hAnsi="Calibri"/>
+          <w:i/>
+          <w:color w:val="64748B"/>
+          <w:sz w:val="17"/>
+        </w:rPr>
+        <w:t>Figura: Pantalla 1: Iniciar Sesión (Android Beta)</w:t>
+      </w:r>
+    </w:p>
+    <w:p>
+      <w:pPr>
+        <w:spacing w:before="240" w:after="80"/>
+      </w:pPr>
+      <w:r>
+        <w:rPr>
+          <w:rFonts w:ascii="Calibri" w:hAnsi="Calibri"/>
+          <w:b/>
+          <w:color w:val="2B6CB0"/>
+          <w:sz w:val="24"/>
+        </w:rPr>
+        <w:t>Pantalla 2: Selección de Tipo de Cuenta (Android Beta)</w:t>
+      </w:r>
+    </w:p>
+    <w:p>
+      <w:pPr>
+        <w:spacing w:before="0" w:after="120" w:line="276" w:lineRule="auto"/>
+      </w:pPr>
+      <w:r>
+        <w:rPr>
+          <w:rFonts w:ascii="Calibri" w:hAnsi="Calibri"/>
+          <w:color w:val="334155"/>
+          <w:sz w:val="20"/>
+        </w:rPr>
+        <w:t>Bifurcación de roles entre 'Soy Cliente' (para consumidores finales) y 'Mi Negocio' (para comercios locales: ferreterías, farmacias, minimarkets).</w:t>
+      </w:r>
+    </w:p>
+    <w:p>
+      <w:pPr>
+        <w:spacing w:before="120" w:after="40"/>
+        <w:jc w:val="center"/>
+      </w:pPr>
+    </w:p>
+    <w:p>
+      <w:r>
+        <w:drawing>
+          <wp:inline xmlns:a="http://schemas.openxmlformats.org/drawingml/2006/main" xmlns:pic="http://schemas.openxmlformats.org/drawingml/2006/picture">
+            <wp:extent cx="2926080" cy="1568768"/>
+            <wp:docPr id="2" name="Picture 2"/>
+            <wp:cNvGraphicFramePr>
+              <a:graphicFrameLocks noChangeAspect="1"/>
+            </wp:cNvGraphicFramePr>
+            <a:graphic>
+              <a:graphicData uri="http://schemas.openxmlformats.org/drawingml/2006/picture">
+                <pic:pic>
+                  <pic:nvPicPr>
+                    <pic:cNvPr id="0" name="02_android_tipo_cuenta.png"/>
+                    <pic:cNvPicPr/>
+                  </pic:nvPicPr>
+                  <pic:blipFill>
+                    <a:blip r:embed="rId11"/>
+                    <a:stretch>
+                      <a:fillRect/>
+                    </a:stretch>
+                  </pic:blipFill>
+                  <pic:spPr>
+                    <a:xfrm>
+                      <a:off x="0" y="0"/>
+                      <a:ext cx="2926080" cy="1568768"/>
+                    </a:xfrm>
+                    <a:prstGeom prst="rect"/>
+                  </pic:spPr>
+                </pic:pic>
+              </a:graphicData>
+            </a:graphic>
+          </wp:inline>
+        </w:drawing>
+      </w:r>
+    </w:p>
+    <w:p>
+      <w:pPr>
+        <w:spacing w:before="40" w:after="160"/>
+        <w:jc w:val="center"/>
+      </w:pPr>
+      <w:r>
+        <w:rPr>
+          <w:rFonts w:ascii="Calibri" w:hAnsi="Calibri"/>
+          <w:i/>
+          <w:color w:val="64748B"/>
+          <w:sz w:val="17"/>
+        </w:rPr>
+        <w:t>Figura: Pantalla 2: Selección de Tipo de Cuenta (Android Beta)</w:t>
+      </w:r>
+    </w:p>
+    <w:p>
+      <w:pPr>
+        <w:spacing w:before="240" w:after="80"/>
+      </w:pPr>
+      <w:r>
+        <w:rPr>
+          <w:rFonts w:ascii="Calibri" w:hAnsi="Calibri"/>
+          <w:b/>
+          <w:color w:val="2B6CB0"/>
+          <w:sz w:val="24"/>
+        </w:rPr>
+        <w:t>Pantalla 3: Crear Negocio - Datos de Cuenta y Negocio (Android Beta)</w:t>
+      </w:r>
+    </w:p>
+    <w:p>
+      <w:pPr>
+        <w:spacing w:before="0" w:after="120" w:line="276" w:lineRule="auto"/>
+      </w:pPr>
+      <w:r>
+        <w:rPr>
+          <w:rFonts w:ascii="Calibri" w:hAnsi="Calibri"/>
+          <w:color w:val="334155"/>
+          <w:sz w:val="20"/>
+        </w:rPr>
+        <w:t>Formulario estructurado en secciones con insignias verdes: 'Datos de la cuenta' (Email, Contraseña, Confirmación) y 'Datos del negocio' (Nombre comercial, Teléfono, Actividad comercial).</w:t>
+      </w:r>
+    </w:p>
+    <w:p>
+      <w:pPr>
+        <w:spacing w:before="120" w:after="40"/>
+        <w:jc w:val="center"/>
+      </w:pPr>
+    </w:p>
+    <w:p>
+      <w:r>
+        <w:drawing>
+          <wp:inline xmlns:a="http://schemas.openxmlformats.org/drawingml/2006/main" xmlns:pic="http://schemas.openxmlformats.org/drawingml/2006/picture">
+            <wp:extent cx="2926080" cy="2608898"/>
+            <wp:docPr id="3" name="Picture 3"/>
+            <wp:cNvGraphicFramePr>
+              <a:graphicFrameLocks noChangeAspect="1"/>
+            </wp:cNvGraphicFramePr>
+            <a:graphic>
+              <a:graphicData uri="http://schemas.openxmlformats.org/drawingml/2006/picture">
+                <pic:pic>
+                  <pic:nvPicPr>
+                    <pic:cNvPr id="0" name="03_android_crear_negocio_part1.png"/>
+                    <pic:cNvPicPr/>
+                  </pic:nvPicPr>
+                  <pic:blipFill>
+                    <a:blip r:embed="rId12"/>
+                    <a:stretch>
+                      <a:fillRect/>
+                    </a:stretch>
+                  </pic:blipFill>
+                  <pic:spPr>
+                    <a:xfrm>
+                      <a:off x="0" y="0"/>
+                      <a:ext cx="2926080" cy="2608898"/>
+                    </a:xfrm>
+                    <a:prstGeom prst="rect"/>
+                  </pic:spPr>
+                </pic:pic>
+              </a:graphicData>
+            </a:graphic>
+          </wp:inline>
+        </w:drawing>
+      </w:r>
+    </w:p>
+    <w:p>
+      <w:pPr>
+        <w:spacing w:before="40" w:after="160"/>
+        <w:jc w:val="center"/>
+      </w:pPr>
+      <w:r>
+        <w:rPr>
+          <w:rFonts w:ascii="Calibri" w:hAnsi="Calibri"/>
+          <w:i/>
+          <w:color w:val="64748B"/>
+          <w:sz w:val="17"/>
+        </w:rPr>
+        <w:t>Figura: Pantalla 3: Crear Negocio - Datos de Cuenta y Negocio (Android Beta)</w:t>
+      </w:r>
+    </w:p>
+    <w:p>
+      <w:pPr>
+        <w:spacing w:before="240" w:after="80"/>
+      </w:pPr>
+      <w:r>
+        <w:rPr>
+          <w:rFonts w:ascii="Calibri" w:hAnsi="Calibri"/>
+          <w:b/>
+          <w:color w:val="2B6CB0"/>
+          <w:sz w:val="24"/>
+        </w:rPr>
+        <w:t>Pantalla 4: Crear Negocio - Ubicación y Términos (Android Beta)</w:t>
+      </w:r>
+    </w:p>
+    <w:p>
+      <w:pPr>
+        <w:spacing w:before="0" w:after="120" w:line="276" w:lineRule="auto"/>
+      </w:pPr>
+      <w:r>
+        <w:rPr>
+          <w:rFonts w:ascii="Calibri" w:hAnsi="Calibri"/>
+          <w:color w:val="334155"/>
+          <w:sz w:val="20"/>
+        </w:rPr>
+        <w:t>Sección 'Ubicación del negocio' con selectores territoriales para Ecuador (Provincia, Cantón, Parroquia), botón 'Marcar ubicación en el mapa', y sección legal con aceptación de Términos y Política de Privacidad.</w:t>
+      </w:r>
+    </w:p>
+    <w:p>
+      <w:pPr>
+        <w:spacing w:before="120" w:after="40"/>
+        <w:jc w:val="center"/>
+      </w:pPr>
+    </w:p>
+    <w:p>
+      <w:r>
+        <w:drawing>
+          <wp:inline xmlns:a="http://schemas.openxmlformats.org/drawingml/2006/main" xmlns:pic="http://schemas.openxmlformats.org/drawingml/2006/picture">
+            <wp:extent cx="2926080" cy="2400300"/>
+            <wp:docPr id="4" name="Picture 4"/>
+            <wp:cNvGraphicFramePr>
+              <a:graphicFrameLocks noChangeAspect="1"/>
+            </wp:cNvGraphicFramePr>
+            <a:graphic>
+              <a:graphicData uri="http://schemas.openxmlformats.org/drawingml/2006/picture">
+                <pic:pic>
+                  <pic:nvPicPr>
+                    <pic:cNvPr id="0" name="04_android_crear_negocio_part2.png"/>
+                    <pic:cNvPicPr/>
+                  </pic:nvPicPr>
+                  <pic:blipFill>
+                    <a:blip r:embed="rId13"/>
+                    <a:stretch>
+                      <a:fillRect/>
+                    </a:stretch>
+                  </pic:blipFill>
+                  <pic:spPr>
+                    <a:xfrm>
+                      <a:off x="0" y="0"/>
+                      <a:ext cx="2926080" cy="2400300"/>
+                    </a:xfrm>
+                    <a:prstGeom prst="rect"/>
+                  </pic:spPr>
+                </pic:pic>
+              </a:graphicData>
+            </a:graphic>
+          </wp:inline>
+        </w:drawing>
+      </w:r>
+    </w:p>
+    <w:p>
+      <w:pPr>
+        <w:spacing w:before="40" w:after="160"/>
+        <w:jc w:val="center"/>
+      </w:pPr>
+      <w:r>
+        <w:rPr>
+          <w:rFonts w:ascii="Calibri" w:hAnsi="Calibri"/>
+          <w:i/>
+          <w:color w:val="64748B"/>
+          <w:sz w:val="17"/>
+        </w:rPr>
+        <w:t>Figura: Pantalla 4: Crear Negocio - Ubicación y Términos (Android Beta)</w:t>
+      </w:r>
+    </w:p>
+    <w:p>
+      <w:pPr>
+        <w:spacing w:before="320" w:after="120"/>
       </w:pPr>
       <w:r>
         <w:rPr>
@@ -82,147 +420,74 @@
         <w:spacing w:before="0" w:after="120" w:line="276" w:lineRule="auto"/>
       </w:pPr>
       <w:r>
-        <w:t>El diagrama de componentes descompone el sistema en módulos de alta cohesión y bajo acoplamiento, separando la interfaz de usuario (Frontend SPA), el backend de servicios desacoplados (API Gateway y Controladores de Dominio) y los proveedores de persistencia y almacenamiento externo:</w:t>
+        <w:rPr>
+          <w:rFonts w:ascii="Calibri" w:hAnsi="Calibri"/>
+          <w:color w:val="334155"/>
+          <w:sz w:val="20"/>
+        </w:rPr>
+        <w:t>Descompone el sistema en módulos desacoplados siguiendo el principio de responsabilidad única. Comprende la interfaz web SPA (con componentes de autenticación, suscripciones dinámicas, verificación KYC y backoffice administrativo), los controladores REST de backend y los repositorios de almacenamiento relacional (PostgreSQL) y binario (Cloud Object Storage S3):</w:t>
       </w:r>
     </w:p>
-    <w:tbl>
-      <w:tblPr>
-        <w:tblW w:type="auto" w:w="0"/>
-        <w:jc w:val="center"/>
-        <w:tblLook w:firstColumn="1" w:firstRow="1" w:lastColumn="0" w:lastRow="0" w:noHBand="0" w:noVBand="1" w:val="04A0"/>
-      </w:tblPr>
-      <w:tblGrid>
-        <w:gridCol w:w="9360"/>
-      </w:tblGrid>
-      <w:tr>
-        <w:tc>
-          <w:tcPr>
-            <w:tcW w:type="dxa" w:w="9360"/>
-            <w:shd w:fill="F8FAFC"/>
-            <w:tcMar>
-              <w:top w:w="120" w:type="dxa"/>
-              <w:bottom w:w="120" w:type="dxa"/>
-              <w:left w:w="160" w:type="dxa"/>
-              <w:right w:w="160" w:type="dxa"/>
-            </w:tcMar>
-            <w:tcBorders>
-              <w:top w:val="single" w:sz="4" w:space="0" w:color="E2E8F0"/>
-              <w:bottom w:val="single" w:sz="4" w:space="0" w:color="E2E8F0"/>
-              <w:left w:val="single" w:sz="18" w:space="0" w:color="2563EB"/>
-              <w:right w:val="single" w:sz="4" w:space="0" w:color="E2E8F0"/>
-            </w:tcBorders>
-          </w:tcPr>
-          <w:p>
-            <w:pPr>
-              <w:spacing w:before="0" w:after="0" w:line="276" w:lineRule="auto"/>
-            </w:pPr>
-            <w:r>
-              <w:rPr>
-                <w:rFonts w:ascii="Calibri" w:hAnsi="Calibri"/>
-                <w:b/>
-                <w:color w:val="1E293B"/>
-                <w:sz w:val="20"/>
-              </w:rPr>
-              <w:t>ESTRUCTURA DE COMPONENTES DEL SISTEMA</w:t>
-              <w:br/>
-              <w:br/>
-            </w:r>
-            <w:r>
-              <w:rPr>
-                <w:rFonts w:ascii="Consolas" w:hAnsi="Consolas"/>
-                <w:color w:val="0F172A"/>
-                <w:sz w:val="17"/>
-              </w:rPr>
-              <w:t>+----------------------------------------------------------------------------------------------------+</w:t>
-              <w:br/>
-              <w:t>| CAPA PRESENTACIÓN (FRONTEND SPA - WEB RESPONSIVE)                                                  |</w:t>
-              <w:br/>
-              <w:t>|  +---------------------------+  +-------------------------------+  +----------------------------+  |</w:t>
-              <w:br/>
-              <w:t>|  | Módulo Registro Comercio  |  | Módulo Suscripción Dinámica   |  | Módulo Verificación &amp; KYC  |  |</w:t>
-              <w:br/>
-              <w:t>|  |  - FormCrearCuenta        |  |  - TarjetaPlanesGrid          |  |  - DatosTributariosForm    |  |</w:t>
-              <w:br/>
-              <w:t>|  |  - DatosNegocioForm       |  |  - PlanModalidadSelector      |  |  - GaleriaLocalUploader    |  |</w:t>
-              <w:br/>
-              <w:t>|  |  - GeoCascadaSelectores   |  |  - ResumenCheckoutCard        |  |  - CtaBancariaForm         |  |</w:t>
-              <w:br/>
-              <w:t>|  |  - MapaGpsPinPicker       |  |                               |  |  - SelfieIdentidadCapture  |  |</w:t>
-              <w:br/>
-              <w:t>|  +---------------------------+  +-------------------------------+  +----------------------------+  |</w:t>
-              <w:br/>
-              <w:t>|  +---------------------------+  +-------------------------------+  +----------------------------+  |</w:t>
-              <w:br/>
-              <w:t>|  | Módulo Estado y Corrección|  | Módulo Backoffice Admin       |  | Capa Servicios HTTP Client |  |</w:t>
-              <w:br/>
-              <w:t>|  |  - StatusTrackerBanner    |  |  - ColaRevisionTable          |  |  - AuthService             |  |</w:t>
-              <w:br/>
-              <w:t>|  |  - FormRechazoEdicion     |  |  - PlanesAdminCrudEditor      |  |  - BusinessService         |  |</w:t>
-              <w:br/>
-              <w:t>|  |  - ReenvioSolicitudBtn    |  |  - AuditoriaLogViewer         |  |  - SubscriptionService     |  |</w:t>
-              <w:br/>
-              <w:t>|  +---------------------------+  +-------------------------------+  +----------------------------+  |</w:t>
-              <w:br/>
-              <w:t>+----------------------------------------------------------------------------------------------------+</w:t>
-              <w:br/>
-              <w:t xml:space="preserve">                                               | HTTPS / JSON (REST API)</w:t>
-              <w:br/>
-              <w:t xml:space="preserve">                                               v</w:t>
-              <w:br/>
-              <w:t>+----------------------------------------------------------------------------------------------------+</w:t>
-              <w:br/>
-              <w:t>| CAPA SERVICIOS BACKEND &amp; CONTROLADORES (API REST)                                                  |</w:t>
-              <w:br/>
-              <w:t>|  +-------------------------+  +-------------------------+  +------------------------------------+  |</w:t>
-              <w:br/>
-              <w:t>|  | BusinessAuthController  |  | SubscriptionController  |  | VerificationKycController          |  |</w:t>
-              <w:br/>
-              <w:t>|  |  - POST /negocio        |  |  - GET /planes/activos  |  |  - POST /verificacion/tributaria   |  |</w:t>
-              <w:br/>
-              <w:t>|  |  - PUT /negocio/:id     |  |  - POST /suscripciones  |  |  - POST /verificacion/evidencias   |  |</w:t>
-              <w:br/>
-              <w:t>|  |                         |  |  - PUT /suscripcion/ren |  |  - POST /verificacion/enviar       |  |</w:t>
-              <w:br/>
-              <w:t>|  +-------------------------+  +-------------------------+  +------------------------------------+  |</w:t>
-              <w:br/>
-              <w:t>|  +-------------------------+  +-------------------------+  +------------------------------------+  |</w:t>
-              <w:br/>
-              <w:t>|  | AdminBackofficeCtrl     |  | NotificationDispatcher  |  | FileStorageService (S3 Proxy)      |  |</w:t>
-              <w:br/>
-              <w:t>|  |  - CRUD /admin/planes   |  |  - EmailWelcomeSender   |  |  - PreSignedUrlGenerator           |  |</w:t>
-              <w:br/>
-              <w:t>|  |  - POST /admin/decision |  |  - WhatsAppNotifier     |  |  - FileValidator (PDF / JPG)       |  |</w:t>
-              <w:br/>
-              <w:t>|  +-------------------------+  +-------------------------+  +------------------------------------+  |</w:t>
-              <w:br/>
-              <w:t>+----------------------------------------------------------------------------------------------------+</w:t>
-              <w:br/>
-              <w:t xml:space="preserve">                        |                                                |</w:t>
-              <w:br/>
-              <w:t xml:space="preserve">                        v (Lectura/Escritura Relacional)                 v (Almacenamiento Binario)</w:t>
-              <w:br/>
-              <w:t>+------------------------------------------------+       +-------------------------------------------+</w:t>
-              <w:br/>
-              <w:t>| BASE DE DATOS TRANSACCIONAL (RDBMS PostgreSQL) |       | BUCKET CLOUD STORAGE (AWS S3 / Spaces)   |</w:t>
-              <w:br/>
-              <w:t>|  - Negocios, Planes, Suscripciones, KYC, Audit |       |  - RUC PDF, Fachada, Rótulo, Interiores,  |</w:t>
-              <w:br/>
-              <w:t>|  - Tablas con Integridad Referencial y ACID    |       |    Selfie con Cédula, Certificado Bancario|</w:t>
-              <w:br/>
-              <w:t>+------------------------------------------------+       +-------------------------------------------+</w:t>
-            </w:r>
-          </w:p>
-        </w:tc>
-      </w:tr>
-    </w:tbl>
     <w:p>
       <w:pPr>
-        <w:spacing w:before="0" w:after="80"/>
+        <w:spacing w:before="120" w:after="40"/>
+        <w:jc w:val="center"/>
       </w:pPr>
     </w:p>
     <w:p>
+      <w:r>
+        <w:drawing>
+          <wp:inline xmlns:a="http://schemas.openxmlformats.org/drawingml/2006/main" xmlns:pic="http://schemas.openxmlformats.org/drawingml/2006/picture">
+            <wp:extent cx="5669280" cy="5822965"/>
+            <wp:docPr id="5" name="Picture 5"/>
+            <wp:cNvGraphicFramePr>
+              <a:graphicFrameLocks noChangeAspect="1"/>
+            </wp:cNvGraphicFramePr>
+            <a:graphic>
+              <a:graphicData uri="http://schemas.openxmlformats.org/drawingml/2006/picture">
+                <pic:pic>
+                  <pic:nvPicPr>
+                    <pic:cNvPr id="0" name="01_componentes.png"/>
+                    <pic:cNvPicPr/>
+                  </pic:nvPicPr>
+                  <pic:blipFill>
+                    <a:blip r:embed="rId14"/>
+                    <a:stretch>
+                      <a:fillRect/>
+                    </a:stretch>
+                  </pic:blipFill>
+                  <pic:spPr>
+                    <a:xfrm>
+                      <a:off x="0" y="0"/>
+                      <a:ext cx="5669280" cy="5822965"/>
+                    </a:xfrm>
+                    <a:prstGeom prst="rect"/>
+                  </pic:spPr>
+                </pic:pic>
+              </a:graphicData>
+            </a:graphic>
+          </wp:inline>
+        </w:drawing>
+      </w:r>
+    </w:p>
+    <w:p>
       <w:pPr>
-        <w:spacing w:before="280" w:after="120"/>
+        <w:spacing w:before="40" w:after="160"/>
+        <w:jc w:val="center"/>
+      </w:pPr>
+      <w:r>
+        <w:rPr>
+          <w:rFonts w:ascii="Calibri" w:hAnsi="Calibri"/>
+          <w:i/>
+          <w:color w:val="64748B"/>
+          <w:sz w:val="17"/>
+        </w:rPr>
+        <w:t>Figura: Diagrama de Componentes del Sistema Tienda Bolsillo Web</w:t>
+      </w:r>
+    </w:p>
+    <w:p>
+      <w:pPr>
+        <w:spacing w:before="320" w:after="120"/>
       </w:pPr>
       <w:r>
         <w:rPr>
@@ -231,170 +496,82 @@
           <w:color w:val="1E293B"/>
           <w:sz w:val="30"/>
         </w:rPr>
-        <w:t>3. Diagrama de Navegación de Pantallas (UI State Navigation)</w:t>
+        <w:t>3. Diagrama de Navegación de Pantallas (UI Navigation)</w:t>
       </w:r>
     </w:p>
-    <w:tbl>
-      <w:tblPr>
-        <w:tblW w:type="auto" w:w="0"/>
-        <w:jc w:val="center"/>
-        <w:tblLook w:firstColumn="1" w:firstRow="1" w:lastColumn="0" w:lastRow="0" w:noHBand="0" w:noVBand="1" w:val="04A0"/>
-      </w:tblPr>
-      <w:tblGrid>
-        <w:gridCol w:w="9360"/>
-      </w:tblGrid>
-      <w:tr>
-        <w:tc>
-          <w:tcPr>
-            <w:tcW w:type="dxa" w:w="9360"/>
-            <w:shd w:fill="F8FAFC"/>
-            <w:tcMar>
-              <w:top w:w="120" w:type="dxa"/>
-              <w:bottom w:w="120" w:type="dxa"/>
-              <w:left w:w="160" w:type="dxa"/>
-              <w:right w:w="160" w:type="dxa"/>
-            </w:tcMar>
-            <w:tcBorders>
-              <w:top w:val="single" w:sz="4" w:space="0" w:color="E2E8F0"/>
-              <w:bottom w:val="single" w:sz="4" w:space="0" w:color="E2E8F0"/>
-              <w:left w:val="single" w:sz="18" w:space="0" w:color="2563EB"/>
-              <w:right w:val="single" w:sz="4" w:space="0" w:color="E2E8F0"/>
-            </w:tcBorders>
-          </w:tcPr>
-          <w:p>
-            <w:pPr>
-              <w:spacing w:before="0" w:after="0" w:line="276" w:lineRule="auto"/>
-            </w:pPr>
-            <w:r>
-              <w:rPr>
-                <w:rFonts w:ascii="Calibri" w:hAnsi="Calibri"/>
-                <w:b/>
-                <w:color w:val="1E293B"/>
-                <w:sz w:val="20"/>
-              </w:rPr>
-              <w:t>MAPA DE PANTALLAS Y TRANSICIONES DEL USUARIO Y ADMINISTRADOR</w:t>
-              <w:br/>
-              <w:br/>
-            </w:r>
-            <w:r>
-              <w:rPr>
-                <w:rFonts w:ascii="Consolas" w:hAnsi="Consolas"/>
-                <w:color w:val="0F172A"/>
-                <w:sz w:val="17"/>
-              </w:rPr>
-              <w:t>[ SCR-01: Iniciar Sesión ]</w:t>
-              <w:br/>
-              <w:t xml:space="preserve">      │ (Clic 'Regístrate')</w:t>
-              <w:br/>
-              <w:t xml:space="preserve">      ▼</w:t>
-              <w:br/>
-              <w:t>[ SCR-02: Selección de Rol ] ──(Opción 'Soy Cliente')──► [ SCR-02A: Próximamente ]</w:t>
-              <w:br/>
-              <w:t xml:space="preserve">      │ (Opción 'Mi Negocio')</w:t>
-              <w:br/>
-              <w:t xml:space="preserve">      ▼</w:t>
-              <w:br/>
-              <w:t>[ SCR-03: Formulario Registro Negocio ]</w:t>
-              <w:br/>
-              <w:t xml:space="preserve">      ├── Datos de la cuenta (Email, Contraseñas)</w:t>
-              <w:br/>
-              <w:t xml:space="preserve">      ├── Datos del negocio (Nombre comercial, Teléfono, Actividad)</w:t>
-              <w:br/>
-              <w:t xml:space="preserve">      ├── Ubicación geográfica (Provincia -&gt; Cantón -&gt; Parroquia)</w:t>
-              <w:br/>
-              <w:t xml:space="preserve">      ├── [ MODAL-01: Marcar Pin en Mapa GPS ]</w:t>
-              <w:br/>
-              <w:t xml:space="preserve">      └── Aceptación de Términos &amp; Privacidad</w:t>
-              <w:br/>
-              <w:t xml:space="preserve">      │ (Submit válido)</w:t>
-              <w:br/>
-              <w:t xml:space="preserve">      ▼</w:t>
-              <w:br/>
-              <w:t>[ SCR-04: Suscripción Premium ]</w:t>
-              <w:br/>
-              <w:t xml:space="preserve">      ├── Tarjetas dinámicas (Anual, Semestral 'Más popular', Mensual)</w:t>
-              <w:br/>
-              <w:t xml:space="preserve">      └── Visualización de Beneficios (PRO, KPI Ventas, Soporte VIP)</w:t>
-              <w:br/>
-              <w:t xml:space="preserve">      │ (Selección y clic 'Comenzar ahora')</w:t>
-              <w:br/>
-              <w:t xml:space="preserve">      ▼</w:t>
-              <w:br/>
-              <w:t>[ SCR-05: Confirmación de Suscripción ] ──► Registra período y vigencia</w:t>
-              <w:br/>
-              <w:t xml:space="preserve">      │ (Clic 'Continuar a Verificación')</w:t>
-              <w:br/>
-              <w:t xml:space="preserve">      ▼</w:t>
-              <w:br/>
-              <w:t>[ SCR-06: Verificación Documental - Paso 1: Datos Tributarios ]</w:t>
-              <w:br/>
-              <w:t xml:space="preserve">      ├── Tipo de persona, RUC, Razón social, Fecha inicio y Carga PDF RUC</w:t>
-              <w:br/>
-              <w:t xml:space="preserve">      ▼</w:t>
-              <w:br/>
-              <w:t>[ SCR-07: Verificación Documental - Paso 2: Evidencias del Establecimiento ]</w:t>
-              <w:br/>
-              <w:t xml:space="preserve">      ├── Carga: Fachada, Rótulo, Interior 1 e Interior 2 (con preview y reemplazo)</w:t>
-              <w:br/>
-              <w:t xml:space="preserve">      ▼</w:t>
-              <w:br/>
-              <w:t>[ SCR-08: Verificación Documental - Paso 3: Datos Bancarios &amp; KYC Personal ]</w:t>
-              <w:br/>
-              <w:t xml:space="preserve">      ├── Banco, Tipo cuenta, Número, Titular, Cédula</w:t>
-              <w:br/>
-              <w:t xml:space="preserve">      └── Carga: Selfie con documento de identificación + Certificado bancario</w:t>
-              <w:br/>
-              <w:t xml:space="preserve">      │ (Validación global y Enviar)</w:t>
-              <w:br/>
-              <w:t xml:space="preserve">      ▼</w:t>
-              <w:br/>
-              <w:t>[ SCR-09: Pantalla de Estado - PENDIENTE DE REVISIÓN ]</w:t>
-              <w:br/>
-              <w:t xml:space="preserve">      ├── Si Aprobado   ──► [ SCR-12: Negocio Verificado / Dashboard Comercial ]</w:t>
-              <w:br/>
-              <w:t xml:space="preserve">      └── Si Rechazado  ──► [ SCR-10: Alerta de Rechazo con Motivos Específicos ]</w:t>
-              <w:br/>
-              <w:t xml:space="preserve">                                  │ (Clic 'Editar información')</w:t>
-              <w:br/>
-              <w:t xml:space="preserve">                                  ▼</w:t>
-              <w:br/>
-              <w:t xml:space="preserve">                            [ SCR-11: Edición de Campos Observados y Reemplazo ]</w:t>
-              <w:br/>
-              <w:t xml:space="preserve">                                  │ (Clic 'Reenviar solicitud')</w:t>
-              <w:br/>
-              <w:t xml:space="preserve">                                  └──► Retorna a [ SCR-09: Pendiente de Revisión ]</w:t>
-              <w:br/>
-              <w:br/>
-              <w:t>----------------------------------------------------------------------------------------</w:t>
-              <w:br/>
-              <w:t>RUTA ADMINISTRATIVA PARALELA (BACKOFFICE):</w:t>
-              <w:br/>
-              <w:t>[ SCR-ADM-01: Login Admin ] ──► [ SCR-ADM-02: Dashboard de Solicitudes en Cola ]</w:t>
-              <w:br/>
-              <w:t xml:space="preserve">                              ──► [ SCR-ADM-03: Panel de Gestión de Planes de Suscripción ]</w:t>
-              <w:br/>
-              <w:t xml:space="preserve">                                      ├── Edición de Precios, Períodos, IVA, Beneficios</w:t>
-              <w:br/>
-              <w:t xml:space="preserve">                                      ├── Toggle Activar/Desactivar modalidad</w:t>
-              <w:br/>
-              <w:t xml:space="preserve">                                      ├── Asignación de etiqueta 'Más popular'</w:t>
-              <w:br/>
-              <w:t xml:space="preserve">                                      ├── [ MODAL-02: Previsualización de Tarjetas ]</w:t>
-              <w:br/>
-              <w:t xml:space="preserve">                                      └── Guardar &amp; Publicar ──► [ SCR-ADM-04: Log Auditoría ]</w:t>
-            </w:r>
-          </w:p>
-        </w:tc>
-      </w:tr>
-    </w:tbl>
     <w:p>
       <w:pPr>
-        <w:spacing w:before="0" w:after="80"/>
+        <w:spacing w:before="0" w:after="120" w:line="276" w:lineRule="auto"/>
+      </w:pPr>
+      <w:r>
+        <w:rPr>
+          <w:rFonts w:ascii="Calibri" w:hAnsi="Calibri"/>
+          <w:color w:val="334155"/>
+          <w:sz w:val="20"/>
+        </w:rPr>
+        <w:t>Modela la secuencia completa de interfaces para el usuario comerciante (desde el Login y selección de rol hasta la verificación documental) y la ruta paralela del Agente Administrativo en el Backoffice (gestión de colas de revisión y administración de suscripciones):</w:t>
+      </w:r>
+    </w:p>
+    <w:p>
+      <w:pPr>
+        <w:spacing w:before="120" w:after="40"/>
+        <w:jc w:val="center"/>
       </w:pPr>
     </w:p>
     <w:p>
+      <w:r>
+        <w:drawing>
+          <wp:inline xmlns:a="http://schemas.openxmlformats.org/drawingml/2006/main" xmlns:pic="http://schemas.openxmlformats.org/drawingml/2006/picture">
+            <wp:extent cx="5669280" cy="16802926"/>
+            <wp:docPr id="6" name="Picture 6"/>
+            <wp:cNvGraphicFramePr>
+              <a:graphicFrameLocks noChangeAspect="1"/>
+            </wp:cNvGraphicFramePr>
+            <a:graphic>
+              <a:graphicData uri="http://schemas.openxmlformats.org/drawingml/2006/picture">
+                <pic:pic>
+                  <pic:nvPicPr>
+                    <pic:cNvPr id="0" name="02_navegacion.png"/>
+                    <pic:cNvPicPr/>
+                  </pic:nvPicPr>
+                  <pic:blipFill>
+                    <a:blip r:embed="rId15"/>
+                    <a:stretch>
+                      <a:fillRect/>
+                    </a:stretch>
+                  </pic:blipFill>
+                  <pic:spPr>
+                    <a:xfrm>
+                      <a:off x="0" y="0"/>
+                      <a:ext cx="5669280" cy="16802926"/>
+                    </a:xfrm>
+                    <a:prstGeom prst="rect"/>
+                  </pic:spPr>
+                </pic:pic>
+              </a:graphicData>
+            </a:graphic>
+          </wp:inline>
+        </w:drawing>
+      </w:r>
+    </w:p>
+    <w:p>
       <w:pPr>
-        <w:spacing w:before="280" w:after="120"/>
+        <w:spacing w:before="40" w:after="160"/>
+        <w:jc w:val="center"/>
+      </w:pPr>
+      <w:r>
+        <w:rPr>
+          <w:rFonts w:ascii="Calibri" w:hAnsi="Calibri"/>
+          <w:i/>
+          <w:color w:val="64748B"/>
+          <w:sz w:val="17"/>
+        </w:rPr>
+        <w:t>Figura: Diagrama de Navegación de Pantallas y Estados de Interfaz</w:t>
+      </w:r>
+    </w:p>
+    <w:p>
+      <w:pPr>
+        <w:spacing w:before="320" w:after="120"/>
       </w:pPr>
       <w:r>
         <w:rPr>
@@ -403,135 +580,82 @@
           <w:color w:val="1E293B"/>
           <w:sz w:val="30"/>
         </w:rPr>
-        <w:t>4. Diagrama de Arquitectura del Sistema (Multi-Tier Architecture)</w:t>
+        <w:t>4. Diagrama de Arquitectura del Sistema (Multi-Tier)</w:t>
       </w:r>
     </w:p>
-    <w:tbl>
-      <w:tblPr>
-        <w:tblW w:type="auto" w:w="0"/>
-        <w:jc w:val="center"/>
-        <w:tblLook w:firstColumn="1" w:firstRow="1" w:lastColumn="0" w:lastRow="0" w:noHBand="0" w:noVBand="1" w:val="04A0"/>
-      </w:tblPr>
-      <w:tblGrid>
-        <w:gridCol w:w="9360"/>
-      </w:tblGrid>
-      <w:tr>
-        <w:tc>
-          <w:tcPr>
-            <w:tcW w:type="dxa" w:w="9360"/>
-            <w:shd w:fill="F8FAFC"/>
-            <w:tcMar>
-              <w:top w:w="120" w:type="dxa"/>
-              <w:bottom w:w="120" w:type="dxa"/>
-              <w:left w:w="160" w:type="dxa"/>
-              <w:right w:w="160" w:type="dxa"/>
-            </w:tcMar>
-            <w:tcBorders>
-              <w:top w:val="single" w:sz="4" w:space="0" w:color="E2E8F0"/>
-              <w:bottom w:val="single" w:sz="4" w:space="0" w:color="E2E8F0"/>
-              <w:left w:val="single" w:sz="18" w:space="0" w:color="2563EB"/>
-              <w:right w:val="single" w:sz="4" w:space="0" w:color="E2E8F0"/>
-            </w:tcBorders>
-          </w:tcPr>
-          <w:p>
-            <w:pPr>
-              <w:spacing w:before="0" w:after="0" w:line="276" w:lineRule="auto"/>
-            </w:pPr>
-            <w:r>
-              <w:rPr>
-                <w:rFonts w:ascii="Calibri" w:hAnsi="Calibri"/>
-                <w:b/>
-                <w:color w:val="1E293B"/>
-                <w:sz w:val="20"/>
-              </w:rPr>
-              <w:t>ARQUITECTURA DE CAPAS, SEGURIDAD Y COMUNICACIÓN</w:t>
-              <w:br/>
-              <w:br/>
-            </w:r>
-            <w:r>
-              <w:rPr>
-                <w:rFonts w:ascii="Consolas" w:hAnsi="Consolas"/>
-                <w:color w:val="0F172A"/>
-                <w:sz w:val="17"/>
-              </w:rPr>
-              <w:t>+----------------------------------------------------------------------------------------+</w:t>
-              <w:br/>
-              <w:t>| CAPA 1: CLIENTES Y NAVEGADORES (Web Desktop / Tablets / Mobile Browsers)               |</w:t>
-              <w:br/>
-              <w:t>|  - Single Page Application (HTML5 / Tailwind CSS / Vanilla JS &amp; Web Components)        |</w:t>
-              <w:br/>
-              <w:t>|  - Renderizado dinámico de tarjetas de planes consumiendo API REST                     |</w:t>
-              <w:br/>
-              <w:t>+----------------------------------------------------------------------------------------+</w:t>
-              <w:br/>
-              <w:t xml:space="preserve">                                   | HTTPS (TLS 1.3 / Certificado SSL)</w:t>
-              <w:br/>
-              <w:t xml:space="preserve">                                   v</w:t>
-              <w:br/>
-              <w:t>+----------------------------------------------------------------------------------------+</w:t>
-              <w:br/>
-              <w:t>| CAPA 2: INGRESS, SEGURIDAD &amp; API GATEWAY                                               |</w:t>
-              <w:br/>
-              <w:t>|  - Reverse Proxy (Nginx) + Rate Limiting (Protección Anti-DDoS y Fuerza Bruta)         |</w:t>
-              <w:br/>
-              <w:t>|  - Autenticación JWT + Control de Acceso Basado en Roles (RBAC: COMERCIO vs ADMIN)     |</w:t>
-              <w:br/>
-              <w:t>|  - Enrutamiento de microservicios y CORS estrictamente configurado                     |</w:t>
-              <w:br/>
-              <w:t>+----------------------------------------------------------------------------------------+</w:t>
-              <w:br/>
-              <w:t xml:space="preserve">                                   |</w:t>
-              <w:br/>
-              <w:t xml:space="preserve">                                   v</w:t>
-              <w:br/>
-              <w:t>+----------------------------------------------------------------------------------------+</w:t>
-              <w:br/>
-              <w:t>| CAPA 3: LÓGICA DE APLICACIÓN Y DOMINIOS (Backend Services)                             |</w:t>
-              <w:br/>
-              <w:t>|  +-------------------------+  +-------------------------+  +-------------------------+ |</w:t>
-              <w:br/>
-              <w:t>|  | Dominio Onboarding      |  | Dominio Suscripciones   |  | Dominio KYC &amp; Revisión  | |</w:t>
-              <w:br/>
-              <w:t>|  |  - Validador de RUC/Céd |  |  - Motor de Precios Din |  |  - Verificador Evidenc  | |</w:t>
-              <w:br/>
-              <w:t>|  |  - Geocodificador GPS   |  |  - Gestor de Vigencia   |  |  - Workflow Estados     | |</w:t>
-              <w:br/>
-              <w:t>|  +-------------------------+  +-------------------------+  +-------------------------+ |</w:t>
-              <w:br/>
-              <w:t>|  +-----------------------------------------------------------------------------------+ |</w:t>
-              <w:br/>
-              <w:t>|  | Módulo de Auditoría y Observabilidad: Registro Inmutable de Cambios de Planes     | |</w:t>
-              <w:br/>
-              <w:t>+----------------------------------------------------------------------------------------+</w:t>
-              <w:br/>
-              <w:t xml:space="preserve">                      |                                            |</w:t>
-              <w:br/>
-              <w:t xml:space="preserve">                      v                                            v</w:t>
-              <w:br/>
-              <w:t>+-----------------------------------------+   +------------------------------------------+</w:t>
-              <w:br/>
-              <w:t>| CAPA 4: ALMACENAMIENTO DE DATOS         |   | CAPA 5: SERVICIOS EXTERNOS &amp; NOTIFICAC.  |</w:t>
-              <w:br/>
-              <w:t>|  - Base de Datos Relacional PostgreSQL  |   |  - Cloud Object Storage (S3 / Spaces)    |</w:t>
-              <w:br/>
-              <w:t>|    (Tablas Normalizadas en 3FN)         |   |  - API de Email Transaccional (Resend)   |</w:t>
-              <w:br/>
-              <w:t>|  - Caché de Planes en Redis             |   |  - API Oficial WhatsApp Cloud (Meta)     |</w:t>
-              <w:br/>
-              <w:t>+-----------------------------------------+   +------------------------------------------+</w:t>
-            </w:r>
-          </w:p>
-        </w:tc>
-      </w:tr>
-    </w:tbl>
     <w:p>
       <w:pPr>
-        <w:spacing w:before="0" w:after="80"/>
+        <w:spacing w:before="0" w:after="120" w:line="276" w:lineRule="auto"/>
+      </w:pPr>
+      <w:r>
+        <w:rPr>
+          <w:rFonts w:ascii="Calibri" w:hAnsi="Calibri"/>
+          <w:color w:val="334155"/>
+          <w:sz w:val="20"/>
+        </w:rPr>
+        <w:t>Estructura la solución en 5 capas: Capa de Clientes Web, Capa Ingress con WAF y terminación SSL TLS 1.3, Capa de Control de Acceso JWT / RBAC, Capa de Lógica de Dominio y Capa de Persistencia/Notificaciones (PostgreSQL, Redis, S3, Email y WhatsApp API):</w:t>
+      </w:r>
+    </w:p>
+    <w:p>
+      <w:pPr>
+        <w:spacing w:before="120" w:after="40"/>
+        <w:jc w:val="center"/>
       </w:pPr>
     </w:p>
     <w:p>
+      <w:r>
+        <w:drawing>
+          <wp:inline xmlns:a="http://schemas.openxmlformats.org/drawingml/2006/main" xmlns:pic="http://schemas.openxmlformats.org/drawingml/2006/picture">
+            <wp:extent cx="5669280" cy="8572225"/>
+            <wp:docPr id="7" name="Picture 7"/>
+            <wp:cNvGraphicFramePr>
+              <a:graphicFrameLocks noChangeAspect="1"/>
+            </wp:cNvGraphicFramePr>
+            <a:graphic>
+              <a:graphicData uri="http://schemas.openxmlformats.org/drawingml/2006/picture">
+                <pic:pic>
+                  <pic:nvPicPr>
+                    <pic:cNvPr id="0" name="03_arquitectura.png"/>
+                    <pic:cNvPicPr/>
+                  </pic:nvPicPr>
+                  <pic:blipFill>
+                    <a:blip r:embed="rId16"/>
+                    <a:stretch>
+                      <a:fillRect/>
+                    </a:stretch>
+                  </pic:blipFill>
+                  <pic:spPr>
+                    <a:xfrm>
+                      <a:off x="0" y="0"/>
+                      <a:ext cx="5669280" cy="8572225"/>
+                    </a:xfrm>
+                    <a:prstGeom prst="rect"/>
+                  </pic:spPr>
+                </pic:pic>
+              </a:graphicData>
+            </a:graphic>
+          </wp:inline>
+        </w:drawing>
+      </w:r>
+    </w:p>
+    <w:p>
       <w:pPr>
-        <w:spacing w:before="280" w:after="120"/>
+        <w:spacing w:before="40" w:after="160"/>
+        <w:jc w:val="center"/>
+      </w:pPr>
+      <w:r>
+        <w:rPr>
+          <w:rFonts w:ascii="Calibri" w:hAnsi="Calibri"/>
+          <w:i/>
+          <w:color w:val="64748B"/>
+          <w:sz w:val="17"/>
+        </w:rPr>
+        <w:t>Figura: Diagrama de Arquitectura en Capas y Seguridad del Sistema</w:t>
+      </w:r>
+    </w:p>
+    <w:p>
+      <w:pPr>
+        <w:spacing w:before="320" w:after="120"/>
       </w:pPr>
       <w:r>
         <w:rPr>
@@ -545,117 +669,73 @@
     </w:p>
     <w:p>
       <w:pPr>
-        <w:spacing w:before="0" w:after="120"/>
+        <w:spacing w:before="0" w:after="120" w:line="276" w:lineRule="auto"/>
       </w:pPr>
       <w:r>
-        <w:t>El modelo entidad-relación garantiza la persistencia íntegra de los 4 bloques funcionales definidos en el Plan de Trabajo, con soporte para auditoría administrativa, suscripciones dinámicas y ciclo de vida de evidencias documentales:</w:t>
+        <w:rPr>
+          <w:rFonts w:ascii="Calibri" w:hAnsi="Calibri"/>
+          <w:color w:val="334155"/>
+          <w:sz w:val="20"/>
+        </w:rPr>
+        <w:t>Define el modelo de datos relacional para dar soporte a los 4 bloques funcionales del Plan de Trabajo. Incluye entidades de USUARIO, NEGOCIO, planes administrables con beneficios, suscripciones por período, solicitudes de verificación con sus 4 tipos de evidencias, y la tabla inmutable de AUDITORIA_PLAN:</w:t>
       </w:r>
     </w:p>
-    <w:tbl>
-      <w:tblPr>
-        <w:tblW w:type="auto" w:w="0"/>
-        <w:jc w:val="center"/>
-        <w:tblLook w:firstColumn="1" w:firstRow="1" w:lastColumn="0" w:lastRow="0" w:noHBand="0" w:noVBand="1" w:val="04A0"/>
-      </w:tblPr>
-      <w:tblGrid>
-        <w:gridCol w:w="9360"/>
-      </w:tblGrid>
-      <w:tr>
-        <w:tc>
-          <w:tcPr>
-            <w:tcW w:type="dxa" w:w="9360"/>
-            <w:shd w:fill="F8FAFC"/>
-            <w:tcMar>
-              <w:top w:w="120" w:type="dxa"/>
-              <w:bottom w:w="120" w:type="dxa"/>
-              <w:left w:w="160" w:type="dxa"/>
-              <w:right w:w="160" w:type="dxa"/>
-            </w:tcMar>
-            <w:tcBorders>
-              <w:top w:val="single" w:sz="4" w:space="0" w:color="E2E8F0"/>
-              <w:bottom w:val="single" w:sz="4" w:space="0" w:color="E2E8F0"/>
-              <w:left w:val="single" w:sz="18" w:space="0" w:color="2563EB"/>
-              <w:right w:val="single" w:sz="4" w:space="0" w:color="E2E8F0"/>
-            </w:tcBorders>
-          </w:tcPr>
-          <w:p>
-            <w:pPr>
-              <w:spacing w:before="0" w:after="0" w:line="276" w:lineRule="auto"/>
-            </w:pPr>
-            <w:r>
-              <w:rPr>
-                <w:rFonts w:ascii="Calibri" w:hAnsi="Calibri"/>
-                <w:b/>
-                <w:color w:val="1E293B"/>
-                <w:sz w:val="20"/>
-              </w:rPr>
-              <w:t>MODELO ENTIDAD-RELACIÓN (CARDINALIDADES Y ATRIBUTOS)</w:t>
-              <w:br/>
-              <w:br/>
-            </w:r>
-            <w:r>
-              <w:rPr>
-                <w:rFonts w:ascii="Consolas" w:hAnsi="Consolas"/>
-                <w:color w:val="0F172A"/>
-                <w:sz w:val="17"/>
-              </w:rPr>
-              <w:t xml:space="preserve"> [ USUARIO ] 1 ─────── 1 [ NEGOCIO ]</w:t>
-              <w:br/>
-              <w:t xml:space="preserve">      │                        │</w:t>
-              <w:br/>
-              <w:t xml:space="preserve">      │ 1                      │ 1</w:t>
-              <w:br/>
-              <w:t xml:space="preserve">      │                        ├── 1 [ SUSCRIPCION_NEGOCIO ] N ── 1 [ PLAN_SUSCRIPCION ]</w:t>
-              <w:br/>
-              <w:t xml:space="preserve">      │ N                      │                                            │ 1</w:t>
-              <w:br/>
-              <w:t xml:space="preserve"> [ AUDITORIA_PLAN ]            │ 1                                          │ N</w:t>
-              <w:br/>
-              <w:t xml:space="preserve">                               └── 1 [ SOLICITUD_VERIFICACION ]       [ BENEFICIO_PLAN ]</w:t>
-              <w:br/>
-              <w:t xml:space="preserve">                                            │</w:t>
-              <w:br/>
-              <w:t xml:space="preserve">                                            ├── 1:1 ── [ DATO_TRIBUTARIO ]</w:t>
-              <w:br/>
-              <w:t xml:space="preserve">                                            ├── 1:N ── [ EVIDENCIA_LOCAL ]</w:t>
-              <w:br/>
-              <w:t xml:space="preserve">                                            ├── 1:1 ── [ DATO_BANCARIO ]</w:t>
-              <w:br/>
-              <w:t xml:space="preserve">                                            └── 1:1 ── [ EVIDENCIA_KYC ]</w:t>
-              <w:br/>
-              <w:br/>
-              <w:t>DICCIONARIO DE ENTIDADES Y CAMPOS PRINCIPALES:</w:t>
-              <w:br/>
-              <w:t>• USUARIO: id (PK), email (UQ), password_hash, rol ('COMERCIO'|'ADMIN'), estado, creado_en</w:t>
-              <w:br/>
-              <w:t>• NEGOCIO: id (PK), usuario_id (FK), nombre_comercial, telefono, actividad_comercial, provincia, canton, parroquia, latitud, longitud, estado_onboarding</w:t>
-              <w:br/>
-              <w:t>• PLAN_SUSCRIPCION: id (PK), codigo ('ANUAL'|'SEMESTRAL'|'MENSUAL'), nombre, precio, periodo_meses, aplica_iva (BOOL), es_mas_popular (BOOL), estado_activo (BOOL), creado_en, actualizado_en</w:t>
-              <w:br/>
-              <w:t>• BENEFICIO_PLAN: id (PK), plan_id (FK), descripcion, orden_visual</w:t>
-              <w:br/>
-              <w:t>• SUSCRIPCION_NEGOCIO: id (PK), negocio_id (FK), plan_id (FK), fecha_inicio, fecha_fin, precio_pagado, estado ('ACTIVA'|'VENCIDA'|'PENDIENTE')</w:t>
-              <w:br/>
-              <w:t>• SOLICITUD_VERIFICACION: id (PK), negocio_id (FK), estado_revision ('PENDIENTE'|'APROBADO'|'RECHAZADO'), observaciones_rechazo (TEXT), revisado_por_admin_id (FK), fecha_envio, fecha_resolucion</w:t>
-              <w:br/>
-              <w:t>• DATO_TRIBUTARIO: id (PK), solicitud_id (FK), tipo_persona ('NATURAL'|'JURIDICA'), ruc (13 digitos), razon_social, fecha_inicio_actividad, url_pdf_ruc</w:t>
-              <w:br/>
-              <w:t>• EVIDENCIA_LOCAL: id (PK), solicitud_id (FK), tipo_foto ('FACHADA'|'ROTULO'|'INTERIOR_1'|'INTERIOR_2'), url_imagen, estado_campo ('APROBADO'|'OBSERVADO')</w:t>
-              <w:br/>
-              <w:t>• DATO_BANCARIO: id (PK), solicitud_id (FK), banco, tipo_cuenta, numero_cuenta, titular_nombre, titular_cedula, email_notificacion, url_certificado_bancario</w:t>
-              <w:br/>
-              <w:t>• EVIDENCIA_KYC: id (PK), solicitud_id (FK), url_selfie_identificacion, estado_campo</w:t>
-              <w:br/>
-              <w:t>• AUDITORIA_PLAN: id (PK), plan_id (FK), admin_usuario_id (FK), valores_previos_json, valores_nuevos_json, fecha_modificacion</w:t>
-            </w:r>
-          </w:p>
-        </w:tc>
-      </w:tr>
-    </w:tbl>
     <w:p>
       <w:pPr>
-        <w:spacing w:before="0" w:after="80"/>
+        <w:spacing w:before="120" w:after="40"/>
+        <w:jc w:val="center"/>
       </w:pPr>
+    </w:p>
+    <w:p>
+      <w:r>
+        <w:drawing>
+          <wp:inline xmlns:a="http://schemas.openxmlformats.org/drawingml/2006/main" xmlns:pic="http://schemas.openxmlformats.org/drawingml/2006/picture">
+            <wp:extent cx="5669280" cy="8828367"/>
+            <wp:docPr id="8" name="Picture 8"/>
+            <wp:cNvGraphicFramePr>
+              <a:graphicFrameLocks noChangeAspect="1"/>
+            </wp:cNvGraphicFramePr>
+            <a:graphic>
+              <a:graphicData uri="http://schemas.openxmlformats.org/drawingml/2006/picture">
+                <pic:pic>
+                  <pic:nvPicPr>
+                    <pic:cNvPr id="0" name="04_entidad_relacion.png"/>
+                    <pic:cNvPicPr/>
+                  </pic:nvPicPr>
+                  <pic:blipFill>
+                    <a:blip r:embed="rId17"/>
+                    <a:stretch>
+                      <a:fillRect/>
+                    </a:stretch>
+                  </pic:blipFill>
+                  <pic:spPr>
+                    <a:xfrm>
+                      <a:off x="0" y="0"/>
+                      <a:ext cx="5669280" cy="8828367"/>
+                    </a:xfrm>
+                    <a:prstGeom prst="rect"/>
+                  </pic:spPr>
+                </pic:pic>
+              </a:graphicData>
+            </a:graphic>
+          </wp:inline>
+        </w:drawing>
+      </w:r>
+    </w:p>
+    <w:p>
+      <w:pPr>
+        <w:spacing w:before="40" w:after="160"/>
+        <w:jc w:val="center"/>
+      </w:pPr>
+      <w:r>
+        <w:rPr>
+          <w:rFonts w:ascii="Calibri" w:hAnsi="Calibri"/>
+          <w:i/>
+          <w:color w:val="64748B"/>
+          <w:sz w:val="17"/>
+        </w:rPr>
+        <w:t>Figura: Diagrama Entidad-Relación (ER) de la Base de Datos</w:t>
+      </w:r>
     </w:p>
     <w:p>
       <w:pPr>
@@ -671,703 +751,509 @@
         <w:t>6. Diagramas de Flujo Específicos por Subproceso</w:t>
       </w:r>
     </w:p>
-    <w:tbl>
-      <w:tblPr>
-        <w:tblW w:type="auto" w:w="0"/>
-        <w:jc w:val="center"/>
-        <w:tblLook w:firstColumn="1" w:firstRow="1" w:lastColumn="0" w:lastRow="0" w:noHBand="0" w:noVBand="1" w:val="04A0"/>
-      </w:tblPr>
-      <w:tblGrid>
-        <w:gridCol w:w="9360"/>
-      </w:tblGrid>
-      <w:tr>
-        <w:tc>
-          <w:tcPr>
-            <w:tcW w:type="dxa" w:w="9360"/>
-            <w:shd w:fill="F8FAFC"/>
-            <w:tcMar>
-              <w:top w:w="120" w:type="dxa"/>
-              <w:bottom w:w="120" w:type="dxa"/>
-              <w:left w:w="160" w:type="dxa"/>
-              <w:right w:w="160" w:type="dxa"/>
-            </w:tcMar>
-            <w:tcBorders>
-              <w:top w:val="single" w:sz="4" w:space="0" w:color="E2E8F0"/>
-              <w:bottom w:val="single" w:sz="4" w:space="0" w:color="E2E8F0"/>
-              <w:left w:val="single" w:sz="18" w:space="0" w:color="2563EB"/>
-              <w:right w:val="single" w:sz="4" w:space="0" w:color="E2E8F0"/>
-            </w:tcBorders>
-          </w:tcPr>
-          <w:p>
-            <w:pPr>
-              <w:spacing w:before="0" w:after="0" w:line="276" w:lineRule="auto"/>
-            </w:pPr>
-            <w:r>
-              <w:rPr>
-                <w:rFonts w:ascii="Calibri" w:hAnsi="Calibri"/>
-                <w:b/>
-                <w:color w:val="1E293B"/>
-                <w:sz w:val="20"/>
-              </w:rPr>
-              <w:t>SUBPROCESO 6.1: CREAR MI NEGOCIO (BLOQUE A)</w:t>
-              <w:br/>
-              <w:br/>
-            </w:r>
-            <w:r>
-              <w:rPr>
-                <w:rFonts w:ascii="Consolas" w:hAnsi="Consolas"/>
-                <w:color w:val="0F172A"/>
-                <w:sz w:val="17"/>
-              </w:rPr>
-              <w:t>(INICIO: Usuario en pantalla de Registro)</w:t>
-              <w:br/>
-              <w:t xml:space="preserve">   │</w:t>
-              <w:br/>
-              <w:t xml:space="preserve">   ▼</w:t>
-              <w:br/>
-              <w:t>[Ingresar Datos de Cuenta: Email, Contraseña, Confirmación]</w:t>
-              <w:br/>
-              <w:t xml:space="preserve">   │</w:t>
-              <w:br/>
-              <w:t xml:space="preserve">   ▼</w:t>
-              <w:br/>
-              <w:t>¿Contraseñas coinciden y Email tiene formato válido?</w:t>
-              <w:br/>
-              <w:t xml:space="preserve">   ├── NO ──► Mostrar alerta visual en el campo y bloquear avance</w:t>
-              <w:br/>
-              <w:t xml:space="preserve">   └── SÍ</w:t>
-              <w:br/>
-              <w:t xml:space="preserve">        │</w:t>
-              <w:br/>
-              <w:t xml:space="preserve">        ▼</w:t>
-              <w:br/>
-              <w:t>[Ingresar Datos del Negocio: Nombre comercial, Teléfono, Actividad]</w:t>
-              <w:br/>
-              <w:t xml:space="preserve">   │</w:t>
-              <w:br/>
-              <w:t xml:space="preserve">   ▼</w:t>
-              <w:br/>
-              <w:t>[Seleccionar Ubicación Geográfica en Cascada: Provincia -&gt; Cantón -&gt; Parroquia]</w:t>
-              <w:br/>
-              <w:t xml:space="preserve">   │</w:t>
-              <w:br/>
-              <w:t xml:space="preserve">   ▼</w:t>
-              <w:br/>
-              <w:t>[Pulsar 'Marcar ubicación en el mapa' -&gt; Modal GPS -&gt; Fijar Pin Satelital]</w:t>
-              <w:br/>
-              <w:t xml:space="preserve">   │</w:t>
-              <w:br/>
-              <w:t xml:space="preserve">   ▼</w:t>
-              <w:br/>
-              <w:t>[Marcar Checkbox: Términos y Condiciones + Política de Privacidad]</w:t>
-              <w:br/>
-              <w:t xml:space="preserve">   │</w:t>
-              <w:br/>
-              <w:t xml:space="preserve">   ▼</w:t>
-              <w:br/>
-              <w:t>¿Todos los campos obligatorios están completos y validados?</w:t>
-              <w:br/>
-              <w:t xml:space="preserve">   ├── NO ──► Botón 'Registrar negocio' permanece deshabilitado</w:t>
-              <w:br/>
-              <w:t xml:space="preserve">   └── SÍ ──► Botón rojo se habilita</w:t>
-              <w:br/>
-              <w:t xml:space="preserve">        │</w:t>
-              <w:br/>
-              <w:t xml:space="preserve">        ▼</w:t>
-              <w:br/>
-              <w:t>[Pulsar 'Registrar negocio' -&gt; Petición POST /api/v1/negocio]</w:t>
-              <w:br/>
-              <w:t xml:space="preserve">        │</w:t>
-              <w:br/>
-              <w:t xml:space="preserve">        ▼</w:t>
-              <w:br/>
-              <w:t>[Sistema crea registros en tablas USUARIO y NEGOCIO con estado 'PRE_REGISTRADO']</w:t>
-              <w:br/>
-              <w:t xml:space="preserve">        │</w:t>
-              <w:br/>
-              <w:t xml:space="preserve">        ▼</w:t>
-              <w:br/>
-              <w:t>(FIN: Redireccionar inmediatamente al Módulo de Suscripción Premium)</w:t>
-            </w:r>
-          </w:p>
-        </w:tc>
-      </w:tr>
-    </w:tbl>
     <w:p>
       <w:pPr>
-        <w:spacing w:before="0" w:after="80"/>
+        <w:spacing w:before="240" w:after="80"/>
+      </w:pPr>
+      <w:r>
+        <w:rPr>
+          <w:rFonts w:ascii="Calibri" w:hAnsi="Calibri"/>
+          <w:b/>
+          <w:color w:val="2B6CB0"/>
+          <w:sz w:val="24"/>
+        </w:rPr>
+        <w:t>6.1 Subproceso: Crear Mi Negocio (Bloque A)</w:t>
+      </w:r>
+    </w:p>
+    <w:p>
+      <w:pPr>
+        <w:spacing w:before="0" w:after="120" w:line="276" w:lineRule="auto"/>
+      </w:pPr>
+      <w:r>
+        <w:rPr>
+          <w:rFonts w:ascii="Calibri" w:hAnsi="Calibri"/>
+          <w:color w:val="334155"/>
+          <w:sz w:val="20"/>
+        </w:rPr>
+        <w:t>Modela la captura y validación en tiempo real de datos de cuenta, datos comerciales, selección territorial en cascada (Ecuador), fijación de coordenadas satelitales en mapa GPS y aceptación legal, culminando con el registro en estado 'PRE_REGISTRADO'.</w:t>
+      </w:r>
+    </w:p>
+    <w:p>
+      <w:pPr>
+        <w:spacing w:before="120" w:after="40"/>
+        <w:jc w:val="center"/>
       </w:pPr>
     </w:p>
-    <w:tbl>
-      <w:tblPr>
-        <w:tblW w:type="auto" w:w="0"/>
-        <w:jc w:val="center"/>
-        <w:tblLook w:firstColumn="1" w:firstRow="1" w:lastColumn="0" w:lastRow="0" w:noHBand="0" w:noVBand="1" w:val="04A0"/>
-      </w:tblPr>
-      <w:tblGrid>
-        <w:gridCol w:w="9360"/>
-      </w:tblGrid>
-      <w:tr>
-        <w:tc>
-          <w:tcPr>
-            <w:tcW w:type="dxa" w:w="9360"/>
-            <w:shd w:fill="F8FAFC"/>
-            <w:tcMar>
-              <w:top w:w="120" w:type="dxa"/>
-              <w:bottom w:w="120" w:type="dxa"/>
-              <w:left w:w="160" w:type="dxa"/>
-              <w:right w:w="160" w:type="dxa"/>
-            </w:tcMar>
-            <w:tcBorders>
-              <w:top w:val="single" w:sz="4" w:space="0" w:color="E2E8F0"/>
-              <w:bottom w:val="single" w:sz="4" w:space="0" w:color="E2E8F0"/>
-              <w:left w:val="single" w:sz="18" w:space="0" w:color="2563EB"/>
-              <w:right w:val="single" w:sz="4" w:space="0" w:color="E2E8F0"/>
-            </w:tcBorders>
-          </w:tcPr>
-          <w:p>
-            <w:pPr>
-              <w:spacing w:before="0" w:after="0" w:line="276" w:lineRule="auto"/>
-            </w:pPr>
-            <w:r>
-              <w:rPr>
-                <w:rFonts w:ascii="Calibri" w:hAnsi="Calibri"/>
-                <w:b/>
-                <w:color w:val="1E293B"/>
-                <w:sz w:val="20"/>
-              </w:rPr>
-              <w:t>SUBPROCESO 6.2: SUSCRIPCIÓN / RENOVACIÓN (BLOQUE B)</w:t>
-              <w:br/>
-              <w:br/>
-            </w:r>
-            <w:r>
-              <w:rPr>
-                <w:rFonts w:ascii="Consolas" w:hAnsi="Consolas"/>
-                <w:color w:val="0F172A"/>
-                <w:sz w:val="17"/>
-              </w:rPr>
-              <w:t>(INICIO: Negocio creado exitosamente o Suscripción próxima a vencer)</w:t>
-              <w:br/>
-              <w:t xml:space="preserve">   │</w:t>
-              <w:br/>
-              <w:t xml:space="preserve">   ▼</w:t>
-              <w:br/>
-              <w:t>[Frontend ejecuta GET /api/v1/planes/activos]</w:t>
-              <w:br/>
-              <w:t xml:space="preserve">   │</w:t>
-              <w:br/>
-              <w:t xml:space="preserve">   ▼</w:t>
-              <w:br/>
-              <w:t>[Sistema renderiza dinámicamente las tarjetas configuradas por Admin]</w:t>
-              <w:br/>
-              <w:t xml:space="preserve">   ├── Tarjeta Anual ($39.99/año)</w:t>
-              <w:br/>
-              <w:t xml:space="preserve">   ├── Tarjeta Semestral ($24.99/semestre) con badge 'Más popular'</w:t>
-              <w:br/>
-              <w:t xml:space="preserve">   └── Tarjeta Mensual ($4.99/mes + IVA)</w:t>
-              <w:br/>
-              <w:t xml:space="preserve">   │</w:t>
-              <w:br/>
-              <w:t xml:space="preserve">   ▼</w:t>
-              <w:br/>
-              <w:t>[Usuario revisa Beneficios: PRO, KPI Ventas, Soporte VIP y selecciona modalidad]</w:t>
-              <w:br/>
-              <w:t xml:space="preserve">   │</w:t>
-              <w:br/>
-              <w:t xml:space="preserve">   ▼</w:t>
-              <w:br/>
-              <w:t>[Usuario hace clic en 'Comenzar ahora']</w:t>
-              <w:br/>
-              <w:t xml:space="preserve">   │</w:t>
-              <w:br/>
-              <w:t xml:space="preserve">   ▼</w:t>
-              <w:br/>
-              <w:t>[Mostrar Pantalla de Confirmación con Resumen de Vigencia y Valores]</w:t>
-              <w:br/>
-              <w:t xml:space="preserve">   │</w:t>
-              <w:br/>
-              <w:t xml:space="preserve">   ▼</w:t>
-              <w:br/>
-              <w:t>¿Usuario confirma la suscripción?</w:t>
-              <w:br/>
-              <w:t xml:space="preserve">   ├── NO (Abandona) ──► El negocio queda creado pero congelado; no avanza a verificación</w:t>
-              <w:br/>
-              <w:t xml:space="preserve">   └── SÍ</w:t>
-              <w:br/>
-              <w:t xml:space="preserve">        │</w:t>
-              <w:br/>
-              <w:t xml:space="preserve">        ▼</w:t>
-              <w:br/>
-              <w:t>[Backend registra en SUSCRIPCION_NEGOCIO con fechas calculadas y precio contratado]</w:t>
-              <w:br/>
-              <w:t xml:space="preserve">        │</w:t>
-              <w:br/>
-              <w:t xml:space="preserve">        ▼</w:t>
-              <w:br/>
-              <w:t>[Actualiza estado del Negocio a 'SUSCRITO_PENDIENTE_VERIFICACION']</w:t>
-              <w:br/>
-              <w:t xml:space="preserve">        │</w:t>
-              <w:br/>
-              <w:t xml:space="preserve">        ▼</w:t>
-              <w:br/>
-              <w:t>(FIN: Transición obligatoria hacia la Verificación Documental)</w:t>
-            </w:r>
-          </w:p>
-        </w:tc>
-      </w:tr>
-    </w:tbl>
+    <w:p>
+      <w:r>
+        <w:drawing>
+          <wp:inline xmlns:a="http://schemas.openxmlformats.org/drawingml/2006/main" xmlns:pic="http://schemas.openxmlformats.org/drawingml/2006/picture">
+            <wp:extent cx="5486400" cy="47623451"/>
+            <wp:docPr id="9" name="Picture 9"/>
+            <wp:cNvGraphicFramePr>
+              <a:graphicFrameLocks noChangeAspect="1"/>
+            </wp:cNvGraphicFramePr>
+            <a:graphic>
+              <a:graphicData uri="http://schemas.openxmlformats.org/drawingml/2006/picture">
+                <pic:pic>
+                  <pic:nvPicPr>
+                    <pic:cNvPr id="0" name="05_subproceso_crear_negocio.png"/>
+                    <pic:cNvPicPr/>
+                  </pic:nvPicPr>
+                  <pic:blipFill>
+                    <a:blip r:embed="rId18"/>
+                    <a:stretch>
+                      <a:fillRect/>
+                    </a:stretch>
+                  </pic:blipFill>
+                  <pic:spPr>
+                    <a:xfrm>
+                      <a:off x="0" y="0"/>
+                      <a:ext cx="5486400" cy="47623451"/>
+                    </a:xfrm>
+                    <a:prstGeom prst="rect"/>
+                  </pic:spPr>
+                </pic:pic>
+              </a:graphicData>
+            </a:graphic>
+          </wp:inline>
+        </w:drawing>
+      </w:r>
+    </w:p>
     <w:p>
       <w:pPr>
-        <w:spacing w:before="0" w:after="80"/>
+        <w:spacing w:before="40" w:after="160"/>
+        <w:jc w:val="center"/>
+      </w:pPr>
+      <w:r>
+        <w:rPr>
+          <w:rFonts w:ascii="Calibri" w:hAnsi="Calibri"/>
+          <w:i/>
+          <w:color w:val="64748B"/>
+          <w:sz w:val="17"/>
+        </w:rPr>
+        <w:t>Figura: 6.1 Subproceso: Crear Mi Negocio (Bloque A)</w:t>
+      </w:r>
+    </w:p>
+    <w:p>
+      <w:pPr>
+        <w:spacing w:before="240" w:after="80"/>
+      </w:pPr>
+      <w:r>
+        <w:rPr>
+          <w:rFonts w:ascii="Calibri" w:hAnsi="Calibri"/>
+          <w:b/>
+          <w:color w:val="2B6CB0"/>
+          <w:sz w:val="24"/>
+        </w:rPr>
+        <w:t>6.2 Subproceso: Suscripción / Renovación (Bloque B)</w:t>
+      </w:r>
+    </w:p>
+    <w:p>
+      <w:pPr>
+        <w:spacing w:before="0" w:after="120" w:line="276" w:lineRule="auto"/>
+      </w:pPr>
+      <w:r>
+        <w:rPr>
+          <w:rFonts w:ascii="Calibri" w:hAnsi="Calibri"/>
+          <w:color w:val="334155"/>
+          <w:sz w:val="20"/>
+        </w:rPr>
+        <w:t>Describe la consulta dinámica de planes activos (Anual $39.99, Semestral $24.99 'Más popular', Mensual $4.99), la visualización de beneficios (PRO, KPI Ventas, VIP), el registro del período contratado y la regla estricta de no avanzar a verificación si no se completa la suscripción.</w:t>
+      </w:r>
+    </w:p>
+    <w:p>
+      <w:pPr>
+        <w:spacing w:before="120" w:after="40"/>
+        <w:jc w:val="center"/>
       </w:pPr>
     </w:p>
-    <w:tbl>
-      <w:tblPr>
-        <w:tblW w:type="auto" w:w="0"/>
-        <w:jc w:val="center"/>
-        <w:tblLook w:firstColumn="1" w:firstRow="1" w:lastColumn="0" w:lastRow="0" w:noHBand="0" w:noVBand="1" w:val="04A0"/>
-      </w:tblPr>
-      <w:tblGrid>
-        <w:gridCol w:w="9360"/>
-      </w:tblGrid>
-      <w:tr>
-        <w:tc>
-          <w:tcPr>
-            <w:tcW w:type="dxa" w:w="9360"/>
-            <w:shd w:fill="F8FAFC"/>
-            <w:tcMar>
-              <w:top w:w="120" w:type="dxa"/>
-              <w:bottom w:w="120" w:type="dxa"/>
-              <w:left w:w="160" w:type="dxa"/>
-              <w:right w:w="160" w:type="dxa"/>
-            </w:tcMar>
-            <w:tcBorders>
-              <w:top w:val="single" w:sz="4" w:space="0" w:color="E2E8F0"/>
-              <w:bottom w:val="single" w:sz="4" w:space="0" w:color="E2E8F0"/>
-              <w:left w:val="single" w:sz="18" w:space="0" w:color="2563EB"/>
-              <w:right w:val="single" w:sz="4" w:space="0" w:color="E2E8F0"/>
-            </w:tcBorders>
-          </w:tcPr>
-          <w:p>
-            <w:pPr>
-              <w:spacing w:before="0" w:after="0" w:line="276" w:lineRule="auto"/>
-            </w:pPr>
-            <w:r>
-              <w:rPr>
-                <w:rFonts w:ascii="Calibri" w:hAnsi="Calibri"/>
-                <w:b/>
-                <w:color w:val="1E293B"/>
-                <w:sz w:val="20"/>
-              </w:rPr>
-              <w:t>SUBPROCESO 6.3: VERIFICACIÓN DOCUMENTAL &amp; KYC (BLOQUE C)</w:t>
-              <w:br/>
-              <w:br/>
-            </w:r>
-            <w:r>
-              <w:rPr>
-                <w:rFonts w:ascii="Consolas" w:hAnsi="Consolas"/>
-                <w:color w:val="0F172A"/>
-                <w:sz w:val="17"/>
-              </w:rPr>
-              <w:t>(INICIO: Suscripción confirmada -&gt; Pantalla de Verificación)</w:t>
-              <w:br/>
-              <w:t xml:space="preserve">   │</w:t>
-              <w:br/>
-              <w:t xml:space="preserve">   ▼</w:t>
-              <w:br/>
-              <w:t>[Fase 5: Datos Tributarios] -&gt; Tipo persona, RUC (13 dígitos), Razón social, Fecha inicio, Carga PDF RUC</w:t>
-              <w:br/>
-              <w:t xml:space="preserve">   │</w:t>
-              <w:br/>
-              <w:t xml:space="preserve">   ▼</w:t>
-              <w:br/>
-              <w:t>[Fase 6: Evidencias Local] -&gt; Carga de 4 fotos (Fachada, Rótulo, Interior 1, Interior 2) con validación de peso y preview</w:t>
-              <w:br/>
-              <w:t xml:space="preserve">   │</w:t>
-              <w:br/>
-              <w:t xml:space="preserve">   ▼</w:t>
-              <w:br/>
-              <w:t>[Fase 7: Datos Bancarios] -&gt; Banco, Tipo cuenta, Número, Titular, Cédula</w:t>
-              <w:br/>
-              <w:t xml:space="preserve">   │</w:t>
-              <w:br/>
-              <w:t xml:space="preserve">   ▼</w:t>
-              <w:br/>
-              <w:t>[Fase 8: Documentación Personal] -&gt; Carga de Selfie sosteniendo Cédula + Certificado bancario</w:t>
-              <w:br/>
-              <w:t xml:space="preserve">   │</w:t>
-              <w:br/>
-              <w:t xml:space="preserve">   ▼</w:t>
-              <w:br/>
-              <w:t>[Fase 9: Validación de Integridad Previa al Envío]</w:t>
-              <w:br/>
-              <w:t>¿Falta algún documento obligatorio o archivo excede límites?</w:t>
-              <w:br/>
-              <w:t xml:space="preserve">   ├── SÍ ──► Indicar qué documento falta o corregir formato</w:t>
-              <w:br/>
-              <w:t xml:space="preserve">   └── NO</w:t>
-              <w:br/>
-              <w:t xml:space="preserve">        │</w:t>
-              <w:br/>
-              <w:t xml:space="preserve">        ▼</w:t>
-              <w:br/>
-              <w:t>[Pulsar 'Enviar para revisión' -&gt; POST /api/v1/verificacion/enviar]</w:t>
-              <w:br/>
-              <w:t xml:space="preserve">        │</w:t>
-              <w:br/>
-              <w:t xml:space="preserve">        ▼</w:t>
-              <w:br/>
-              <w:t>[Archivos suben a Cloud Storage S3; se crea SOLICITUD_VERIFICACION en 'PENDIENTE_REVISION']</w:t>
-              <w:br/>
-              <w:t xml:space="preserve">        │</w:t>
-              <w:br/>
-              <w:t xml:space="preserve">        ▼</w:t>
-              <w:br/>
-              <w:t>(FIN: Se muestra pantalla de espera y se notifica al panel administrativo)</w:t>
-            </w:r>
-          </w:p>
-        </w:tc>
-      </w:tr>
-    </w:tbl>
+    <w:p>
+      <w:r>
+        <w:drawing>
+          <wp:inline xmlns:a="http://schemas.openxmlformats.org/drawingml/2006/main" xmlns:pic="http://schemas.openxmlformats.org/drawingml/2006/picture">
+            <wp:extent cx="5486400" cy="17814275"/>
+            <wp:docPr id="10" name="Picture 10"/>
+            <wp:cNvGraphicFramePr>
+              <a:graphicFrameLocks noChangeAspect="1"/>
+            </wp:cNvGraphicFramePr>
+            <a:graphic>
+              <a:graphicData uri="http://schemas.openxmlformats.org/drawingml/2006/picture">
+                <pic:pic>
+                  <pic:nvPicPr>
+                    <pic:cNvPr id="0" name="06_subproceso_suscripcion.png"/>
+                    <pic:cNvPicPr/>
+                  </pic:nvPicPr>
+                  <pic:blipFill>
+                    <a:blip r:embed="rId19"/>
+                    <a:stretch>
+                      <a:fillRect/>
+                    </a:stretch>
+                  </pic:blipFill>
+                  <pic:spPr>
+                    <a:xfrm>
+                      <a:off x="0" y="0"/>
+                      <a:ext cx="5486400" cy="17814275"/>
+                    </a:xfrm>
+                    <a:prstGeom prst="rect"/>
+                  </pic:spPr>
+                </pic:pic>
+              </a:graphicData>
+            </a:graphic>
+          </wp:inline>
+        </w:drawing>
+      </w:r>
+    </w:p>
     <w:p>
       <w:pPr>
-        <w:spacing w:before="0" w:after="80"/>
+        <w:spacing w:before="40" w:after="160"/>
+        <w:jc w:val="center"/>
+      </w:pPr>
+      <w:r>
+        <w:rPr>
+          <w:rFonts w:ascii="Calibri" w:hAnsi="Calibri"/>
+          <w:i/>
+          <w:color w:val="64748B"/>
+          <w:sz w:val="17"/>
+        </w:rPr>
+        <w:t>Figura: 6.2 Subproceso: Suscripción / Renovación (Bloque B)</w:t>
+      </w:r>
+    </w:p>
+    <w:p>
+      <w:pPr>
+        <w:spacing w:before="240" w:after="80"/>
+      </w:pPr>
+      <w:r>
+        <w:rPr>
+          <w:rFonts w:ascii="Calibri" w:hAnsi="Calibri"/>
+          <w:b/>
+          <w:color w:val="2B6CB0"/>
+          <w:sz w:val="24"/>
+        </w:rPr>
+        <w:t>6.3 Subproceso: Verificación Documental (Bloque C)</w:t>
+      </w:r>
+    </w:p>
+    <w:p>
+      <w:pPr>
+        <w:spacing w:before="0" w:after="120" w:line="276" w:lineRule="auto"/>
+      </w:pPr>
+      <w:r>
+        <w:rPr>
+          <w:rFonts w:ascii="Calibri" w:hAnsi="Calibri"/>
+          <w:color w:val="334155"/>
+          <w:sz w:val="20"/>
+        </w:rPr>
+        <w:t>Detalla las 4 etapas probatorias requeridas: Datos tributarios (RUC activo en PDF), Evidencias fotográficas del local (Fachada, Rótulo, Interior 1, Interior 2), Datos bancarios y Documentación personal (Selfie con cédula y Certificado bancario), finalizando con la solicitud en 'PENDIENTE_REVISION'.</w:t>
+      </w:r>
+    </w:p>
+    <w:p>
+      <w:pPr>
+        <w:spacing w:before="120" w:after="40"/>
+        <w:jc w:val="center"/>
       </w:pPr>
     </w:p>
-    <w:tbl>
-      <w:tblPr>
-        <w:tblW w:type="auto" w:w="0"/>
-        <w:jc w:val="center"/>
-        <w:tblLook w:firstColumn="1" w:firstRow="1" w:lastColumn="0" w:lastRow="0" w:noHBand="0" w:noVBand="1" w:val="04A0"/>
-      </w:tblPr>
-      <w:tblGrid>
-        <w:gridCol w:w="9360"/>
-      </w:tblGrid>
-      <w:tr>
-        <w:tc>
-          <w:tcPr>
-            <w:tcW w:type="dxa" w:w="9360"/>
-            <w:shd w:fill="F8FAFC"/>
-            <w:tcMar>
-              <w:top w:w="120" w:type="dxa"/>
-              <w:bottom w:w="120" w:type="dxa"/>
-              <w:left w:w="160" w:type="dxa"/>
-              <w:right w:w="160" w:type="dxa"/>
-            </w:tcMar>
-            <w:tcBorders>
-              <w:top w:val="single" w:sz="4" w:space="0" w:color="E2E8F0"/>
-              <w:bottom w:val="single" w:sz="4" w:space="0" w:color="E2E8F0"/>
-              <w:left w:val="single" w:sz="18" w:space="0" w:color="2563EB"/>
-              <w:right w:val="single" w:sz="4" w:space="0" w:color="E2E8F0"/>
-            </w:tcBorders>
-          </w:tcPr>
-          <w:p>
-            <w:pPr>
-              <w:spacing w:before="0" w:after="0" w:line="276" w:lineRule="auto"/>
-            </w:pPr>
-            <w:r>
-              <w:rPr>
-                <w:rFonts w:ascii="Calibri" w:hAnsi="Calibri"/>
-                <w:b/>
-                <w:color w:val="1E293B"/>
-                <w:sz w:val="20"/>
-              </w:rPr>
-              <w:t>SUBPROCESO 6.4: RECHAZO -&gt; EDICIÓN -&gt; REENVÍO (GESTIÓN DE OBSERVACIONES)</w:t>
-              <w:br/>
-              <w:br/>
-            </w:r>
-            <w:r>
-              <w:rPr>
-                <w:rFonts w:ascii="Consolas" w:hAnsi="Consolas"/>
-                <w:color w:val="0F172A"/>
-                <w:sz w:val="17"/>
-              </w:rPr>
-              <w:t>(INICIO: Agente administrativo revisa solicitud en el Panel Backoffice)</w:t>
-              <w:br/>
-              <w:t xml:space="preserve">   │</w:t>
-              <w:br/>
-              <w:t xml:space="preserve">   ▼</w:t>
-              <w:br/>
-              <w:t>¿Los documentos y fotos cumplen con las políticas?</w:t>
-              <w:br/>
-              <w:t xml:space="preserve">   ├── SÍ ──► Pasa al Subproceso 6.6 (Aprobación y Alta)</w:t>
-              <w:br/>
-              <w:t xml:space="preserve">   └── NO</w:t>
-              <w:br/>
-              <w:t xml:space="preserve">        │</w:t>
-              <w:br/>
-              <w:t xml:space="preserve">        ▼</w:t>
-              <w:br/>
-              <w:t>[Admin selecciona campos observados (ej: 'Foto de fachada borrosa', 'RUC vencido')]</w:t>
-              <w:br/>
-              <w:t xml:space="preserve">        │</w:t>
-              <w:br/>
-              <w:t xml:space="preserve">        ▼</w:t>
-              <w:br/>
-              <w:t>[Admin redacta motivo detallado y pulsa 'Rechazar con observaciones']</w:t>
-              <w:br/>
-              <w:t xml:space="preserve">        │</w:t>
-              <w:br/>
-              <w:t xml:space="preserve">        ▼</w:t>
-              <w:br/>
-              <w:t>[Sistema cambia estado a 'RECHAZADO_REQUIERE_CORRECCION' y despacha email/WhatsApp]</w:t>
-              <w:br/>
-              <w:t xml:space="preserve">        │</w:t>
-              <w:br/>
-              <w:t xml:space="preserve">        ▼</w:t>
-              <w:br/>
-              <w:t>[Usuario ingresa a la web -&gt; Ve banner rojo con el motivo exacto del rechazo]</w:t>
-              <w:br/>
-              <w:t xml:space="preserve">        │</w:t>
-              <w:br/>
-              <w:t xml:space="preserve">        ▼</w:t>
-              <w:br/>
-              <w:t>[Usuario pulsa 'Editar información' -&gt; Solo se desbloquean los campos observados]</w:t>
-              <w:br/>
-              <w:t xml:space="preserve">        │</w:t>
-              <w:br/>
-              <w:t xml:space="preserve">        ▼</w:t>
-              <w:br/>
-              <w:t>[Usuario carga el nuevo archivo o corrige el dato observado y pulsa 'Reenviar solicitud']</w:t>
-              <w:br/>
-              <w:t xml:space="preserve">        │</w:t>
-              <w:br/>
-              <w:t xml:space="preserve">        ▼</w:t>
-              <w:br/>
-              <w:t>[Sistema actualiza SOLICITUD_VERIFICACION y retorna el estado a 'PENDIENTE_REVISION']</w:t>
-              <w:br/>
-              <w:t xml:space="preserve">        │</w:t>
-              <w:br/>
-              <w:t xml:space="preserve">        ▼</w:t>
-              <w:br/>
-              <w:t>(FIN: La solicitud reingresa a la cola del evaluador administrativo)</w:t>
-            </w:r>
-          </w:p>
-        </w:tc>
-      </w:tr>
-    </w:tbl>
+    <w:p>
+      <w:r>
+        <w:drawing>
+          <wp:inline xmlns:a="http://schemas.openxmlformats.org/drawingml/2006/main" xmlns:pic="http://schemas.openxmlformats.org/drawingml/2006/picture">
+            <wp:extent cx="5486400" cy="45453164"/>
+            <wp:docPr id="11" name="Picture 11"/>
+            <wp:cNvGraphicFramePr>
+              <a:graphicFrameLocks noChangeAspect="1"/>
+            </wp:cNvGraphicFramePr>
+            <a:graphic>
+              <a:graphicData uri="http://schemas.openxmlformats.org/drawingml/2006/picture">
+                <pic:pic>
+                  <pic:nvPicPr>
+                    <pic:cNvPr id="0" name="07_subproceso_verificacion.png"/>
+                    <pic:cNvPicPr/>
+                  </pic:nvPicPr>
+                  <pic:blipFill>
+                    <a:blip r:embed="rId20"/>
+                    <a:stretch>
+                      <a:fillRect/>
+                    </a:stretch>
+                  </pic:blipFill>
+                  <pic:spPr>
+                    <a:xfrm>
+                      <a:off x="0" y="0"/>
+                      <a:ext cx="5486400" cy="45453164"/>
+                    </a:xfrm>
+                    <a:prstGeom prst="rect"/>
+                  </pic:spPr>
+                </pic:pic>
+              </a:graphicData>
+            </a:graphic>
+          </wp:inline>
+        </w:drawing>
+      </w:r>
+    </w:p>
     <w:p>
       <w:pPr>
-        <w:spacing w:before="0" w:after="80"/>
+        <w:spacing w:before="40" w:after="160"/>
+        <w:jc w:val="center"/>
+      </w:pPr>
+      <w:r>
+        <w:rPr>
+          <w:rFonts w:ascii="Calibri" w:hAnsi="Calibri"/>
+          <w:i/>
+          <w:color w:val="64748B"/>
+          <w:sz w:val="17"/>
+        </w:rPr>
+        <w:t>Figura: 6.3 Subproceso: Verificación Documental (Bloque C)</w:t>
+      </w:r>
+    </w:p>
+    <w:p>
+      <w:pPr>
+        <w:spacing w:before="240" w:after="80"/>
+      </w:pPr>
+      <w:r>
+        <w:rPr>
+          <w:rFonts w:ascii="Calibri" w:hAnsi="Calibri"/>
+          <w:b/>
+          <w:color w:val="2B6CB0"/>
+          <w:sz w:val="24"/>
+        </w:rPr>
+        <w:t>6.4 Subproceso: Rechazo ➔ Edición ➔ Reenvío (Gestión de Observaciones)</w:t>
+      </w:r>
+    </w:p>
+    <w:p>
+      <w:pPr>
+        <w:spacing w:before="0" w:after="120" w:line="276" w:lineRule="auto"/>
+      </w:pPr>
+      <w:r>
+        <w:rPr>
+          <w:rFonts w:ascii="Calibri" w:hAnsi="Calibri"/>
+          <w:color w:val="334155"/>
+          <w:sz w:val="20"/>
+        </w:rPr>
+        <w:t>Circuito de fiscalización donde el agente administrativo identifica inconsistencias, redacta causales específicas y el sistema notifica al comercio, desbloqueando únicamente los campos observados para su reemplazo y reenvío prioritario.</w:t>
+      </w:r>
+    </w:p>
+    <w:p>
+      <w:pPr>
+        <w:spacing w:before="120" w:after="40"/>
+        <w:jc w:val="center"/>
       </w:pPr>
     </w:p>
-    <w:tbl>
-      <w:tblPr>
-        <w:tblW w:type="auto" w:w="0"/>
-        <w:jc w:val="center"/>
-        <w:tblLook w:firstColumn="1" w:firstRow="1" w:lastColumn="0" w:lastRow="0" w:noHBand="0" w:noVBand="1" w:val="04A0"/>
-      </w:tblPr>
-      <w:tblGrid>
-        <w:gridCol w:w="9360"/>
-      </w:tblGrid>
-      <w:tr>
-        <w:tc>
-          <w:tcPr>
-            <w:tcW w:type="dxa" w:w="9360"/>
-            <w:shd w:fill="F8FAFC"/>
-            <w:tcMar>
-              <w:top w:w="120" w:type="dxa"/>
-              <w:bottom w:w="120" w:type="dxa"/>
-              <w:left w:w="160" w:type="dxa"/>
-              <w:right w:w="160" w:type="dxa"/>
-            </w:tcMar>
-            <w:tcBorders>
-              <w:top w:val="single" w:sz="4" w:space="0" w:color="E2E8F0"/>
-              <w:bottom w:val="single" w:sz="4" w:space="0" w:color="E2E8F0"/>
-              <w:left w:val="single" w:sz="18" w:space="0" w:color="2563EB"/>
-              <w:right w:val="single" w:sz="4" w:space="0" w:color="E2E8F0"/>
-            </w:tcBorders>
-          </w:tcPr>
-          <w:p>
-            <w:pPr>
-              <w:spacing w:before="0" w:after="0" w:line="276" w:lineRule="auto"/>
-            </w:pPr>
-            <w:r>
-              <w:rPr>
-                <w:rFonts w:ascii="Calibri" w:hAnsi="Calibri"/>
-                <w:b/>
-                <w:color w:val="1E293B"/>
-                <w:sz w:val="20"/>
-              </w:rPr>
-              <w:t>SUBPROCESO 6.5: ADMINISTRACIÓN DE PLANES DE SUSCRIPCIÓN (BLOQUE D)</w:t>
-              <w:br/>
-              <w:br/>
-            </w:r>
-            <w:r>
-              <w:rPr>
-                <w:rFonts w:ascii="Consolas" w:hAnsi="Consolas"/>
-                <w:color w:val="0F172A"/>
-                <w:sz w:val="17"/>
-              </w:rPr>
-              <w:t>(INICIO: Administrador autorizado ingresa a /admin/suscripciones)</w:t>
-              <w:br/>
-              <w:t xml:space="preserve">   │</w:t>
-              <w:br/>
-              <w:t xml:space="preserve">   ▼</w:t>
-              <w:br/>
-              <w:t>[Sistema lista modalidades vigentes: Anual, Semestral, Mensual con sus atributos]</w:t>
-              <w:br/>
-              <w:t xml:space="preserve">   │</w:t>
-              <w:br/>
-              <w:t xml:space="preserve">   ▼</w:t>
-              <w:br/>
-              <w:t>[Admin selecciona una modalidad para editar o pulsa 'Crear nueva modalidad']</w:t>
-              <w:br/>
-              <w:t xml:space="preserve">   │</w:t>
-              <w:br/>
-              <w:t xml:space="preserve">   ▼</w:t>
-              <w:br/>
-              <w:t>[Formulario de Configuración: Precio, Período, IVA aplica/no, Beneficios, Activo/Inactivo]</w:t>
-              <w:br/>
-              <w:t xml:space="preserve">   │</w:t>
-              <w:br/>
-              <w:t xml:space="preserve">   ▼</w:t>
-              <w:br/>
-              <w:t>[Admin asigna la etiqueta 'Más popular' (Regla: solo 1 plan puede ser Más Popular a la vez)]</w:t>
-              <w:br/>
-              <w:t xml:space="preserve">   │</w:t>
-              <w:br/>
-              <w:t xml:space="preserve">   ▼</w:t>
-              <w:br/>
-              <w:t>¿Valores cumplen reglas (Precio &gt;= 0, textos no vacíos)?</w:t>
-              <w:br/>
-              <w:t xml:space="preserve">   ├── NO ──► Sistema bloquea y muestra mensaje de validación</w:t>
-              <w:br/>
-              <w:t xml:space="preserve">   └── SÍ</w:t>
-              <w:br/>
-              <w:t xml:space="preserve">        │</w:t>
-              <w:br/>
-              <w:t xml:space="preserve">        ▼</w:t>
-              <w:br/>
-              <w:t>[Admin pulsa 'Previsualizar' -&gt; Modal renderiza las tarjetas exactamente como las verá el usuario]</w:t>
-              <w:br/>
-              <w:t xml:space="preserve">        │</w:t>
-              <w:br/>
-              <w:t xml:space="preserve">        ▼</w:t>
-              <w:br/>
-              <w:t>[Admin pulsa 'Confirmar y Publicar cambios']</w:t>
-              <w:br/>
-              <w:t xml:space="preserve">        │</w:t>
-              <w:br/>
-              <w:t xml:space="preserve">        ▼</w:t>
-              <w:br/>
-              <w:t>[Backend actualiza PLAN_SUSCRIPCION y registra entrada en tabla AUDITORIA_PLAN]</w:t>
-              <w:br/>
-              <w:t xml:space="preserve">        │</w:t>
-              <w:br/>
-              <w:t xml:space="preserve">        ▼</w:t>
-              <w:br/>
-              <w:t>(FIN: Nuevos precios y condiciones quedan visibles al instante en la web sin compilar código)</w:t>
-            </w:r>
-          </w:p>
-        </w:tc>
-      </w:tr>
-    </w:tbl>
+    <w:p>
+      <w:r>
+        <w:drawing>
+          <wp:inline xmlns:a="http://schemas.openxmlformats.org/drawingml/2006/main" xmlns:pic="http://schemas.openxmlformats.org/drawingml/2006/picture">
+            <wp:extent cx="5486400" cy="24936680"/>
+            <wp:docPr id="12" name="Picture 12"/>
+            <wp:cNvGraphicFramePr>
+              <a:graphicFrameLocks noChangeAspect="1"/>
+            </wp:cNvGraphicFramePr>
+            <a:graphic>
+              <a:graphicData uri="http://schemas.openxmlformats.org/drawingml/2006/picture">
+                <pic:pic>
+                  <pic:nvPicPr>
+                    <pic:cNvPr id="0" name="08_subproceso_rechazo_reenvio.png"/>
+                    <pic:cNvPicPr/>
+                  </pic:nvPicPr>
+                  <pic:blipFill>
+                    <a:blip r:embed="rId21"/>
+                    <a:stretch>
+                      <a:fillRect/>
+                    </a:stretch>
+                  </pic:blipFill>
+                  <pic:spPr>
+                    <a:xfrm>
+                      <a:off x="0" y="0"/>
+                      <a:ext cx="5486400" cy="24936680"/>
+                    </a:xfrm>
+                    <a:prstGeom prst="rect"/>
+                  </pic:spPr>
+                </pic:pic>
+              </a:graphicData>
+            </a:graphic>
+          </wp:inline>
+        </w:drawing>
+      </w:r>
+    </w:p>
     <w:p>
       <w:pPr>
-        <w:spacing w:before="0" w:after="80"/>
+        <w:spacing w:before="40" w:after="160"/>
+        <w:jc w:val="center"/>
+      </w:pPr>
+      <w:r>
+        <w:rPr>
+          <w:rFonts w:ascii="Calibri" w:hAnsi="Calibri"/>
+          <w:i/>
+          <w:color w:val="64748B"/>
+          <w:sz w:val="17"/>
+        </w:rPr>
+        <w:t>Figura: 6.4 Subproceso: Rechazo ➔ Edición ➔ Reenvío (Gestión de Observaciones)</w:t>
+      </w:r>
+    </w:p>
+    <w:p>
+      <w:pPr>
+        <w:spacing w:before="240" w:after="80"/>
+      </w:pPr>
+      <w:r>
+        <w:rPr>
+          <w:rFonts w:ascii="Calibri" w:hAnsi="Calibri"/>
+          <w:b/>
+          <w:color w:val="2B6CB0"/>
+          <w:sz w:val="24"/>
+        </w:rPr>
+        <w:t>6.5 Subproceso: Administración de Planes (Bloque D)</w:t>
+      </w:r>
+    </w:p>
+    <w:p>
+      <w:pPr>
+        <w:spacing w:before="0" w:after="120" w:line="276" w:lineRule="auto"/>
+      </w:pPr>
+      <w:r>
+        <w:rPr>
+          <w:rFonts w:ascii="Calibri" w:hAnsi="Calibri"/>
+          <w:color w:val="334155"/>
+          <w:sz w:val="20"/>
+        </w:rPr>
+        <w:t>Flujo exclusivo del Agente Administrativo en el panel Backoffice para editar precios, períodos, IVA, beneficios y plan destacado, con previsualización interactiva de tarjetas, registro de auditoría y reflejo instantáneo en la web sin modificar código.</w:t>
+      </w:r>
+    </w:p>
+    <w:p>
+      <w:pPr>
+        <w:spacing w:before="120" w:after="40"/>
+        <w:jc w:val="center"/>
       </w:pPr>
     </w:p>
-    <w:tbl>
-      <w:tblPr>
-        <w:tblW w:type="auto" w:w="0"/>
-        <w:jc w:val="center"/>
-        <w:tblLook w:firstColumn="1" w:firstRow="1" w:lastColumn="0" w:lastRow="0" w:noHBand="0" w:noVBand="1" w:val="04A0"/>
-      </w:tblPr>
-      <w:tblGrid>
-        <w:gridCol w:w="9360"/>
-      </w:tblGrid>
-      <w:tr>
-        <w:tc>
-          <w:tcPr>
-            <w:tcW w:type="dxa" w:w="9360"/>
-            <w:shd w:fill="F8FAFC"/>
-            <w:tcMar>
-              <w:top w:w="120" w:type="dxa"/>
-              <w:bottom w:w="120" w:type="dxa"/>
-              <w:left w:w="160" w:type="dxa"/>
-              <w:right w:w="160" w:type="dxa"/>
-            </w:tcMar>
-            <w:tcBorders>
-              <w:top w:val="single" w:sz="4" w:space="0" w:color="E2E8F0"/>
-              <w:bottom w:val="single" w:sz="4" w:space="0" w:color="E2E8F0"/>
-              <w:left w:val="single" w:sz="18" w:space="0" w:color="2563EB"/>
-              <w:right w:val="single" w:sz="4" w:space="0" w:color="E2E8F0"/>
-            </w:tcBorders>
-          </w:tcPr>
-          <w:p>
-            <w:pPr>
-              <w:spacing w:before="0" w:after="0" w:line="276" w:lineRule="auto"/>
-            </w:pPr>
-            <w:r>
-              <w:rPr>
-                <w:rFonts w:ascii="Calibri" w:hAnsi="Calibri"/>
-                <w:b/>
-                <w:color w:val="1E293B"/>
-                <w:sz w:val="20"/>
-              </w:rPr>
-              <w:t>SUBPROCESO 6.6: GENERACIÓN/ENVÍO DE CREDENCIAL Y ALTA DEL USUARIO</w:t>
-              <w:br/>
-              <w:br/>
-            </w:r>
-            <w:r>
-              <w:rPr>
-                <w:rFonts w:ascii="Consolas" w:hAnsi="Consolas"/>
-                <w:color w:val="0F172A"/>
-                <w:sz w:val="17"/>
-              </w:rPr>
-              <w:t>(INICIO: Agente administrativo dictamina 'APROBADO' en la cola de revisión)</w:t>
-              <w:br/>
-              <w:t xml:space="preserve">   │</w:t>
-              <w:br/>
-              <w:t xml:space="preserve">   ▼</w:t>
-              <w:br/>
-              <w:t>[Admin pulsa botón 'Aprobar negocio']</w:t>
-              <w:br/>
-              <w:t xml:space="preserve">   │</w:t>
-              <w:br/>
-              <w:t xml:space="preserve">   ▼</w:t>
-              <w:br/>
-              <w:t>[Sistema ejecuta transacción atómica en base de datos]:</w:t>
-              <w:br/>
-              <w:t xml:space="preserve">   ├── Cambia estado de SOLICITUD_VERIFICACION a 'APROBADO'</w:t>
-              <w:br/>
-              <w:t xml:space="preserve">   ├── Cambia estado de NEGOCIO a 'VERIFICADO_ACTIVO'</w:t>
-              <w:br/>
-              <w:t xml:space="preserve">   ├── Asigna rol con privilegios comerciales plenos al USUARIO</w:t>
-              <w:br/>
-              <w:t xml:space="preserve">   └── Genera Token / Credencial de Alta Definitiva con vigencia de la suscripción</w:t>
-              <w:br/>
-              <w:t xml:space="preserve">   │</w:t>
-              <w:br/>
-              <w:t xml:space="preserve">   ▼</w:t>
-              <w:br/>
-              <w:t>[Dispatcher de Notificaciones activa envíos multicanal]:</w:t>
-              <w:br/>
-              <w:t xml:space="preserve">   ├── Envía Email Oficial de Bienvenida con Credencial PDF y Enlace al Dashboard</w:t>
-              <w:br/>
-              <w:t xml:space="preserve">   └── Envía WhatsApp con mensaje de bienvenida y confirmación de alta</w:t>
-              <w:br/>
-              <w:t xml:space="preserve">   │</w:t>
-              <w:br/>
-              <w:t xml:space="preserve">   ▼</w:t>
-              <w:br/>
-              <w:t>[El comercio queda visible en la red comercial de Tienda Bolsillo]</w:t>
-              <w:br/>
-              <w:t xml:space="preserve">   │</w:t>
-              <w:br/>
-              <w:t xml:space="preserve">   ▼</w:t>
-              <w:br/>
-              <w:t>(FIN: El dueño ingresa a su Dashboard y comienza la carga de productos y ventas)</w:t>
-            </w:r>
-          </w:p>
-        </w:tc>
-      </w:tr>
-    </w:tbl>
+    <w:p>
+      <w:r>
+        <w:drawing>
+          <wp:inline xmlns:a="http://schemas.openxmlformats.org/drawingml/2006/main" xmlns:pic="http://schemas.openxmlformats.org/drawingml/2006/picture">
+            <wp:extent cx="5486400" cy="38305648"/>
+            <wp:docPr id="13" name="Picture 13"/>
+            <wp:cNvGraphicFramePr>
+              <a:graphicFrameLocks noChangeAspect="1"/>
+            </wp:cNvGraphicFramePr>
+            <a:graphic>
+              <a:graphicData uri="http://schemas.openxmlformats.org/drawingml/2006/picture">
+                <pic:pic>
+                  <pic:nvPicPr>
+                    <pic:cNvPr id="0" name="09_subproceso_admin_planes.png"/>
+                    <pic:cNvPicPr/>
+                  </pic:nvPicPr>
+                  <pic:blipFill>
+                    <a:blip r:embed="rId22"/>
+                    <a:stretch>
+                      <a:fillRect/>
+                    </a:stretch>
+                  </pic:blipFill>
+                  <pic:spPr>
+                    <a:xfrm>
+                      <a:off x="0" y="0"/>
+                      <a:ext cx="5486400" cy="38305648"/>
+                    </a:xfrm>
+                    <a:prstGeom prst="rect"/>
+                  </pic:spPr>
+                </pic:pic>
+              </a:graphicData>
+            </a:graphic>
+          </wp:inline>
+        </w:drawing>
+      </w:r>
+    </w:p>
     <w:p>
       <w:pPr>
-        <w:spacing w:before="0" w:after="80"/>
+        <w:spacing w:before="40" w:after="160"/>
+        <w:jc w:val="center"/>
       </w:pPr>
+      <w:r>
+        <w:rPr>
+          <w:rFonts w:ascii="Calibri" w:hAnsi="Calibri"/>
+          <w:i/>
+          <w:color w:val="64748B"/>
+          <w:sz w:val="17"/>
+        </w:rPr>
+        <w:t>Figura: 6.5 Subproceso: Administración de Planes (Bloque D)</w:t>
+      </w:r>
+    </w:p>
+    <w:p>
+      <w:pPr>
+        <w:spacing w:before="240" w:after="80"/>
+      </w:pPr>
+      <w:r>
+        <w:rPr>
+          <w:rFonts w:ascii="Calibri" w:hAnsi="Calibri"/>
+          <w:b/>
+          <w:color w:val="2B6CB0"/>
+          <w:sz w:val="24"/>
+        </w:rPr>
+        <w:t>6.6 Subproceso: Generación/Envío de Credencial y Alta del Usuario</w:t>
+      </w:r>
+    </w:p>
+    <w:p>
+      <w:pPr>
+        <w:spacing w:before="0" w:after="120" w:line="276" w:lineRule="auto"/>
+      </w:pPr>
+      <w:r>
+        <w:rPr>
+          <w:rFonts w:ascii="Calibri" w:hAnsi="Calibri"/>
+          <w:color w:val="334155"/>
+          <w:sz w:val="20"/>
+        </w:rPr>
+        <w:t>Cierre del ciclo comercial con dictamen favorable: cambio atómico de estado a 'VERIFICADO_ACTIVO', asignación de rol comercial pleno, generación de credencial digital, notificación multicanal (Email y WhatsApp) y habilitación en el marketplace para vender.</w:t>
+      </w:r>
+    </w:p>
+    <w:p>
+      <w:pPr>
+        <w:spacing w:before="120" w:after="40"/>
+        <w:jc w:val="center"/>
+      </w:pPr>
+    </w:p>
+    <w:p>
+      <w:r>
+        <w:drawing>
+          <wp:inline xmlns:a="http://schemas.openxmlformats.org/drawingml/2006/main" xmlns:pic="http://schemas.openxmlformats.org/drawingml/2006/picture">
+            <wp:extent cx="5486400" cy="6907576"/>
+            <wp:docPr id="14" name="Picture 14"/>
+            <wp:cNvGraphicFramePr>
+              <a:graphicFrameLocks noChangeAspect="1"/>
+            </wp:cNvGraphicFramePr>
+            <a:graphic>
+              <a:graphicData uri="http://schemas.openxmlformats.org/drawingml/2006/picture">
+                <pic:pic>
+                  <pic:nvPicPr>
+                    <pic:cNvPr id="0" name="10_subproceso_alta_usuario.png"/>
+                    <pic:cNvPicPr/>
+                  </pic:nvPicPr>
+                  <pic:blipFill>
+                    <a:blip r:embed="rId23"/>
+                    <a:stretch>
+                      <a:fillRect/>
+                    </a:stretch>
+                  </pic:blipFill>
+                  <pic:spPr>
+                    <a:xfrm>
+                      <a:off x="0" y="0"/>
+                      <a:ext cx="5486400" cy="6907576"/>
+                    </a:xfrm>
+                    <a:prstGeom prst="rect"/>
+                  </pic:spPr>
+                </pic:pic>
+              </a:graphicData>
+            </a:graphic>
+          </wp:inline>
+        </w:drawing>
+      </w:r>
+    </w:p>
+    <w:p>
+      <w:pPr>
+        <w:spacing w:before="40" w:after="160"/>
+        <w:jc w:val="center"/>
+      </w:pPr>
+      <w:r>
+        <w:rPr>
+          <w:rFonts w:ascii="Calibri" w:hAnsi="Calibri"/>
+          <w:i/>
+          <w:color w:val="64748B"/>
+          <w:sz w:val="17"/>
+        </w:rPr>
+        <w:t>Figura: 6.6 Subproceso: Generación/Envío de Credencial y Alta del Usuario</w:t>
+      </w:r>
     </w:p>
     <w:p>
       <w:pPr>
@@ -1380,18 +1266,25 @@
           <w:color w:val="1E293B"/>
           <w:sz w:val="30"/>
         </w:rPr>
-        <w:t>7. Conclusiones y Trazabilidad de Requerimientos</w:t>
+        <w:t>7. Trazabilidad Scrum y Repositorio de Código</w:t>
       </w:r>
     </w:p>
     <w:p>
       <w:pPr>
-        <w:spacing w:before="0" w:after="200" w:line="276" w:lineRule="auto"/>
+        <w:spacing w:before="0" w:after="120" w:line="276" w:lineRule="auto"/>
       </w:pPr>
       <w:r>
-        <w:t>Esta especificación cubre con exactitud las 23 Historias de Usuario (HU-01 a HU-23) y las 2 Épicas del plan de trabajo. Asegura que el desarrollo frontend ya disponible en el repositorio de GitHub se conecte armónicamente con los servicios de suscripción dinámica, verificación documental y administración previstos para los Sprints 2 al 7.</w:t>
+        <w:rPr>
+          <w:rFonts w:ascii="Calibri" w:hAnsi="Calibri"/>
+          <w:color w:val="334155"/>
+          <w:sz w:val="20"/>
+        </w:rPr>
+        <w:t>Este documento visual y técnico garantiza la cobertura exhaustiva de las 23 Historias de Usuario (HU-01 a HU-23), las 2 Épicas (EP-01 y EP-02) y la Definition of Done establecidas en el Plan de Trabajo de Jeanderli Mendoza.</w:t>
         <w:br/>
         <w:br/>
-        <w:t>Repositorio oficial de la entrega: https://github.com/diegotorres006/Login_Version_Beta_TiendaBolsillo</w:t>
+        <w:t>El código frontend correspondiente a este diseño se encuentra publicado y disponible en el repositorio oficial:</w:t>
+        <w:br/>
+        <w:t>https://github.com/diegotorres006/Login_Version_Beta_TiendaBolsillo</w:t>
       </w:r>
     </w:p>
     <w:sectPr>
@@ -1413,7 +1306,7 @@
       <w:jc w:val="right"/>
     </w:pPr>
     <w:r>
-      <w:t>Tienda Bolsillo • Dossier de Arquitectura, Componentes y Flujos de Software (Scrum)</w:t>
+      <w:t>Tienda Bolsillo • Dossier Gráfico de Arquitectura, Pantallas y Subprocesos (Scrum)</w:t>
     </w:r>
   </w:p>
 </w:hdr>
@@ -1785,7 +1678,7 @@
     <w:rPr>
       <w:rFonts w:ascii="Calibri" w:hAnsi="Calibri"/>
       <w:i/>
-      <w:sz w:val="21"/>
+      <w:sz w:val="19"/>
     </w:rPr>
   </w:style>
   <w:style w:type="paragraph" w:styleId="Header">

</xml_diff>